<commit_message>
docs: align frozen Round 3 evidence and add labeled examiner demo video
Co-authored-by: Cursor <cursoragent@cursor.com>
</commit_message>
<xml_diff>
--- a/docs/VaaniQ_IEEE_Research_Paper_Draft.docx
+++ b/docs/VaaniQ_IEEE_Research_Paper_Draft.docx
@@ -10,7 +10,7 @@
         <w:rPr>
           <w:rFonts w:ascii="Times New Roman" w:hAnsi="Times New Roman"/>
           <w:b/>
-          <w:sz w:val="36"/>
+          <w:sz w:val="32"/>
         </w:rPr>
         <w:t>VaaniQ: Cross-Lingual, Compression-Robust Detection and Calibrated Reliability Estimation for AI-Generated Voice in Indian Languages</w:t>
       </w:r>
@@ -33,10 +33,10 @@
       </w:pPr>
       <w:r>
         <w:rPr>
-          <w:b/>
-          <w:sz w:val="18"/>
+          <w:i/>
+          <w:sz w:val="16"/>
         </w:rPr>
-        <w:t>Mid-Term Capstone Research Paper Draft - Academic Year 2026-27</w:t>
+        <w:t>Approved Round 3 research paper - frozen at commit 084bd47ca6ca1b69a7cdbf424e2946f3794c2a95</w:t>
       </w:r>
     </w:p>
     <w:p>
@@ -47,10 +47,10 @@
         <w:rPr>
           <w:b/>
         </w:rPr>
-        <w:t>Abstract:</w:t>
+        <w:t>Abstract-</w:t>
       </w:r>
       <w:r>
-        <w:t>AI-generated speech creates a fraud risk in linguistically diverse and compression-heavy communication channels. VaaniQ evaluates real Kathbath and generated IndicSynth speech in Hindi, Marathi, and Tamil using a speaker-disjoint benchmark, a deterministic acoustic front-end, an AASIST-compatible anti-spoofing head, and validation-only temperature scaling. On 584 held-out evaluation instances, the measured accuracy is 91.6%, equal error rate is 6.6%, F1 is 91.4%, post-calibration ECE is 0.026, and Brier score is 0.069. Results are restricted to the persisted bounded subset and do not imply performance on the complete source corpora.</w:t>
+        <w:t>VaaniQ studies multilingual audio-deepfake detection under language and codec shift rather than claiming universal deepfake detection. A bounded V1 benchmark of Kathbath real speech and IndicSynth fake speech covers Hindi, Marathi, and Tamil with speaker-disjoint evaluation (held-out n=584). An acoustic-embedding plus AASIST-compatible head reached 91.61% accuracy and 6.56% EER. Frozen facebook/wav2vec2-xls-r-300m with mean pooling reached 92.12% accuracy, 6.88% EER, and 0.9828 ROC-AUC. Experiments include WhatsApp-style 16 kbps Opus simulation, leave-one-language-out transfer, and validation-selected calibration. Benchmark V2 remains a partial external-source pilot. Human-study protocol ready; participant data collection pending (N=0).</w:t>
       </w:r>
     </w:p>
     <w:p>
@@ -61,10 +61,10 @@
         <w:rPr>
           <w:b/>
         </w:rPr>
-        <w:t>Index Terms</w:t>
+        <w:t>Index Terms-</w:t>
       </w:r>
       <w:r>
-        <w:t>audio deepfake detection, Indian languages, Kathbath, IndicSynth, Opus compression, calibration, AASIST</w:t>
+        <w:t>audio deepfake detection, Indian languages, Kathbath, IndicSynth, WhatsApp-style Opus simulation, calibration, frozen XLS-R, speaker-disjoint evaluation</w:t>
       </w:r>
     </w:p>
     <w:p>
@@ -98,7 +98,7 @@
         <w:jc w:val="both"/>
       </w:pPr>
       <w:r>
-        <w:t>Voice cloning can imitate speakers from short reference recordings and can be delivered through compressed messaging channels. Existing major anti-spoofing benchmarks are concentrated in English or Mandarin. VaaniQ targets Hindi, Marathi, and Tamil and combines detection, codec robustness, calibrated confidence, explainability, and a human-perception protocol.</w:t>
+        <w:t>Voice cloning can imitate speakers from short recordings and can be delivered as compressed messaging audio. Major anti-spoofing benchmarks remain concentrated in English or Mandarin. VaaniQ studies Hindi, Marathi, and Tamil on a bounded speaker-disjoint benchmark and measures codec shift, cross-lingual transfer, and confidence calibration. It does not claim universal fake-voice detection.</w:t>
       </w:r>
     </w:p>
     <w:p>
@@ -108,7 +108,7 @@
         <w:jc w:val="both"/>
       </w:pPr>
       <w:r>
-        <w:t>The project addresses five research questions: compression degradation (RQ1), multilingual versus English-only training (RQ2), zero-shot cross-lingual transfer (RQ3), calibration under compression (RQ4), and human-versus-model performance on identical stimuli (RQ5). This mid-term draft reports only completed, reproducible subset experiments.</w:t>
+        <w:t>Five research questions are stated. RQ1: How does Opus compression affect detection performance? RQ2: How does English-only anti-spoofing transfer to Hindi, Marathi, and Tamil relative to multilingual training? RQ3: How well does the detector generalize to an unseen Indian language? RQ4: Does validation-selected post-hoc calibration remain reliable under held-out language/condition shift? RQ5: How does model performance compare with human listeners? RQ1-RQ4 are COMPLETE on the declared V1 benchmark. RQ5 is PENDING with N=0.</w:t>
       </w:r>
     </w:p>
     <w:p>
@@ -132,7 +132,7 @@
         <w:jc w:val="both"/>
       </w:pPr>
       <w:r>
-        <w:t>AASIST integrates spectro-temporal graph attention for anti-spoofing [1]. XLS-R provides cross-lingual self-supervised speech representations [2]. IndicSUPERB introduced Kathbath, a large human-labelled Indian-language speech resource [3], while IndicSynth provides synthetic speech for twelve Indian languages [4]. Prior calibration research demonstrates that high classification accuracy does not guarantee trustworthy confidence [5].</w:t>
+        <w:t>AASIST integrates spectro-temporal graph attention for anti-spoofing [1]. XLS-R provides cross-lingual self-supervised speech representations [2]. IndicSUPERB introduced Kathbath, a large human-labelled Indian-language speech resource [3]. IndicSynth provides synthetic speech for Indian languages [4]. Prior work shows that high classification accuracy does not guarantee calibrated confidence [5]. Muller et al. studied human perception of audio deepfakes [6]. To the best of our reviewed literature, the contribution is the integrated evaluation of Indic languages, codec shift, cross-lingual transfer, calibration, and human-study infrastructure rather than invention of XLS-R or AASIST.</w:t>
       </w:r>
     </w:p>
     <w:p>
@@ -146,7 +146,7 @@
           <w:b/>
           <w:sz w:val="20"/>
         </w:rPr>
-        <w:t>III. DATASET AND EXPERIMENTAL PROTOCOL</w:t>
+        <w:t>III. DATASET</w:t>
       </w:r>
     </w:p>
     <w:p>
@@ -159,7 +159,7 @@
           <w:i/>
           <w:sz w:val="20"/>
         </w:rPr>
-        <w:t>A. Sources and Licences</w:t>
+        <w:t>A. Bounded V1 Benchmark</w:t>
       </w:r>
     </w:p>
     <w:p>
@@ -169,7 +169,17 @@
         <w:jc w:val="both"/>
       </w:pPr>
       <w:r>
-        <w:t>The persisted source subset contains 1800 original clips (3.15 h). Bonafide clips are drawn from ai4bharat/Kathbath under its published packaging terms; generated clips are drawn from vdivyasharma/IndicSynth under CC BY-NC 4.0 for non-commercial academic research. The subset is balanced by source label and language.</w:t>
+        <w:t>The persisted source subset contains 1800 original clips (3.15 h): 900 Kathbath REAL and 900 IndicSynth FAKE, balanced across Hindi, Marathi, and Tamil. Paired validation/test 16 kbps libopus twins expand evaluation to 2,346 instances. Held-out test n=584. Bonafide clips follow Kathbath packaging terms; generated clips follow IndicSynth CC BY-NC 4.0 for non-commercial academic research.</w:t>
+      </w:r>
+    </w:p>
+    <w:p>
+      <w:pPr>
+        <w:spacing w:after="40" w:line="240" w:lineRule="auto"/>
+        <w:ind w:firstLine="230"/>
+        <w:jc w:val="both"/>
+      </w:pPr>
+      <w:r>
+        <w:t>V1 has a structural weakness: REAL equals Kathbath and FAKE equals IndicSynth. Source identity is therefore associated with class. Speaker-disjoint splitting protects against speaker leakage but does not remove source-domain shortcuts.</w:t>
       </w:r>
     </w:p>
     <w:p>
@@ -182,7 +192,7 @@
           <w:i/>
           <w:sz w:val="20"/>
         </w:rPr>
-        <w:t>B. Leakage Control</w:t>
+        <w:t>B. Partial V2 External-Source Pilot</w:t>
       </w:r>
     </w:p>
     <w:p>
@@ -192,7 +202,7 @@
         <w:jc w:val="both"/>
       </w:pPr>
       <w:r>
-        <w:t>Source and target speaker identifiers are normalized before a deterministic SHA-256 seeded 70/15/15 split. A pre-training assertion rejects any speaker appearing in more than one split. Clean and 16 kbps libopus twins retain the same speaker, label, pair identifier, and split.</w:t>
+        <w:t>Benchmark V2 is currently a partial external-source pilot. It adds an independent real-speech source but does not yet eliminate source-label confounding. Current cells are Kathbath×real 1,177, IndicSynth×fake 1,169, and FLEURS×real 50. Generator tags exist (freevc24 805; xtts_v2 364), but generator-disjoint evaluation has n=0 and remains PENDING.</w:t>
       </w:r>
     </w:p>
     <w:p>
@@ -204,7 +214,585 @@
           <w:b/>
           <w:sz w:val="16"/>
         </w:rPr>
-        <w:t>TABLE I. SPEAKER-DISJOINT DATA PARTITIONS</w:t>
+        <w:t>TABLE I. DATASET COMPOSITION</w:t>
+      </w:r>
+    </w:p>
+    <w:tbl>
+      <w:tblPr>
+        <w:tblStyle w:val="TableGrid"/>
+        <w:tblW w:type="auto" w:w="0"/>
+        <w:tblLook w:firstColumn="1" w:firstRow="1" w:lastColumn="0" w:lastRow="0" w:noHBand="0" w:noVBand="1" w:val="04A0"/>
+      </w:tblPr>
+      <w:tblGrid>
+        <w:gridCol w:w="2068"/>
+        <w:gridCol w:w="2068"/>
+        <w:gridCol w:w="2068"/>
+        <w:gridCol w:w="2068"/>
+        <w:gridCol w:w="2068"/>
+      </w:tblGrid>
+      <w:tr>
+        <w:tc>
+          <w:tcPr>
+            <w:tcW w:type="dxa" w:w="2068"/>
+          </w:tcPr>
+          <w:p>
+            <w:pPr>
+              <w:spacing w:after="0"/>
+            </w:pPr>
+            <w:r>
+              <w:rPr>
+                <w:rFonts w:ascii="Times New Roman" w:hAnsi="Times New Roman"/>
+                <w:b/>
+                <w:sz w:val="15"/>
+              </w:rPr>
+              <w:t>Benchmark</w:t>
+            </w:r>
+          </w:p>
+        </w:tc>
+        <w:tc>
+          <w:tcPr>
+            <w:tcW w:type="dxa" w:w="2068"/>
+          </w:tcPr>
+          <w:p>
+            <w:pPr>
+              <w:spacing w:after="0"/>
+            </w:pPr>
+            <w:r>
+              <w:rPr>
+                <w:rFonts w:ascii="Times New Roman" w:hAnsi="Times New Roman"/>
+                <w:b/>
+                <w:sz w:val="15"/>
+              </w:rPr>
+              <w:t>Source</w:t>
+            </w:r>
+          </w:p>
+        </w:tc>
+        <w:tc>
+          <w:tcPr>
+            <w:tcW w:type="dxa" w:w="2068"/>
+          </w:tcPr>
+          <w:p>
+            <w:pPr>
+              <w:spacing w:after="0"/>
+            </w:pPr>
+            <w:r>
+              <w:rPr>
+                <w:rFonts w:ascii="Times New Roman" w:hAnsi="Times New Roman"/>
+                <w:b/>
+                <w:sz w:val="15"/>
+              </w:rPr>
+              <w:t>Class</w:t>
+            </w:r>
+          </w:p>
+        </w:tc>
+        <w:tc>
+          <w:tcPr>
+            <w:tcW w:type="dxa" w:w="2068"/>
+          </w:tcPr>
+          <w:p>
+            <w:pPr>
+              <w:spacing w:after="0"/>
+            </w:pPr>
+            <w:r>
+              <w:rPr>
+                <w:rFonts w:ascii="Times New Roman" w:hAnsi="Times New Roman"/>
+                <w:b/>
+                <w:sz w:val="15"/>
+              </w:rPr>
+              <w:t>Count</w:t>
+            </w:r>
+          </w:p>
+        </w:tc>
+        <w:tc>
+          <w:tcPr>
+            <w:tcW w:type="dxa" w:w="2068"/>
+          </w:tcPr>
+          <w:p>
+            <w:pPr>
+              <w:spacing w:after="0"/>
+            </w:pPr>
+            <w:r>
+              <w:rPr>
+                <w:rFonts w:ascii="Times New Roman" w:hAnsi="Times New Roman"/>
+                <w:b/>
+                <w:sz w:val="15"/>
+              </w:rPr>
+              <w:t>Status</w:t>
+            </w:r>
+          </w:p>
+        </w:tc>
+      </w:tr>
+      <w:tr>
+        <w:tc>
+          <w:tcPr>
+            <w:tcW w:type="dxa" w:w="2068"/>
+          </w:tcPr>
+          <w:p>
+            <w:pPr>
+              <w:spacing w:after="0"/>
+            </w:pPr>
+            <w:r>
+              <w:rPr>
+                <w:rFonts w:ascii="Times New Roman" w:hAnsi="Times New Roman"/>
+                <w:b w:val="0"/>
+                <w:sz w:val="15"/>
+              </w:rPr>
+              <w:t>V1</w:t>
+            </w:r>
+          </w:p>
+        </w:tc>
+        <w:tc>
+          <w:tcPr>
+            <w:tcW w:type="dxa" w:w="2068"/>
+          </w:tcPr>
+          <w:p>
+            <w:pPr>
+              <w:spacing w:after="0"/>
+            </w:pPr>
+            <w:r>
+              <w:rPr>
+                <w:rFonts w:ascii="Times New Roman" w:hAnsi="Times New Roman"/>
+                <w:b w:val="0"/>
+                <w:sz w:val="15"/>
+              </w:rPr>
+              <w:t>Kathbath</w:t>
+            </w:r>
+          </w:p>
+        </w:tc>
+        <w:tc>
+          <w:tcPr>
+            <w:tcW w:type="dxa" w:w="2068"/>
+          </w:tcPr>
+          <w:p>
+            <w:pPr>
+              <w:spacing w:after="0"/>
+            </w:pPr>
+            <w:r>
+              <w:rPr>
+                <w:rFonts w:ascii="Times New Roman" w:hAnsi="Times New Roman"/>
+                <w:b w:val="0"/>
+                <w:sz w:val="15"/>
+              </w:rPr>
+              <w:t>REAL</w:t>
+            </w:r>
+          </w:p>
+        </w:tc>
+        <w:tc>
+          <w:tcPr>
+            <w:tcW w:type="dxa" w:w="2068"/>
+          </w:tcPr>
+          <w:p>
+            <w:pPr>
+              <w:spacing w:after="0"/>
+            </w:pPr>
+            <w:r>
+              <w:rPr>
+                <w:rFonts w:ascii="Times New Roman" w:hAnsi="Times New Roman"/>
+                <w:b w:val="0"/>
+                <w:sz w:val="15"/>
+              </w:rPr>
+              <w:t>900</w:t>
+            </w:r>
+          </w:p>
+        </w:tc>
+        <w:tc>
+          <w:tcPr>
+            <w:tcW w:type="dxa" w:w="2068"/>
+          </w:tcPr>
+          <w:p>
+            <w:pPr>
+              <w:spacing w:after="0"/>
+            </w:pPr>
+            <w:r>
+              <w:rPr>
+                <w:rFonts w:ascii="Times New Roman" w:hAnsi="Times New Roman"/>
+                <w:b w:val="0"/>
+                <w:sz w:val="15"/>
+              </w:rPr>
+              <w:t>COMPLETE</w:t>
+            </w:r>
+          </w:p>
+        </w:tc>
+      </w:tr>
+      <w:tr>
+        <w:tc>
+          <w:tcPr>
+            <w:tcW w:type="dxa" w:w="2068"/>
+          </w:tcPr>
+          <w:p>
+            <w:pPr>
+              <w:spacing w:after="0"/>
+            </w:pPr>
+            <w:r>
+              <w:rPr>
+                <w:rFonts w:ascii="Times New Roman" w:hAnsi="Times New Roman"/>
+                <w:b w:val="0"/>
+                <w:sz w:val="15"/>
+              </w:rPr>
+              <w:t>V1</w:t>
+            </w:r>
+          </w:p>
+        </w:tc>
+        <w:tc>
+          <w:tcPr>
+            <w:tcW w:type="dxa" w:w="2068"/>
+          </w:tcPr>
+          <w:p>
+            <w:pPr>
+              <w:spacing w:after="0"/>
+            </w:pPr>
+            <w:r>
+              <w:rPr>
+                <w:rFonts w:ascii="Times New Roman" w:hAnsi="Times New Roman"/>
+                <w:b w:val="0"/>
+                <w:sz w:val="15"/>
+              </w:rPr>
+              <w:t>IndicSynth</w:t>
+            </w:r>
+          </w:p>
+        </w:tc>
+        <w:tc>
+          <w:tcPr>
+            <w:tcW w:type="dxa" w:w="2068"/>
+          </w:tcPr>
+          <w:p>
+            <w:pPr>
+              <w:spacing w:after="0"/>
+            </w:pPr>
+            <w:r>
+              <w:rPr>
+                <w:rFonts w:ascii="Times New Roman" w:hAnsi="Times New Roman"/>
+                <w:b w:val="0"/>
+                <w:sz w:val="15"/>
+              </w:rPr>
+              <w:t>FAKE</w:t>
+            </w:r>
+          </w:p>
+        </w:tc>
+        <w:tc>
+          <w:tcPr>
+            <w:tcW w:type="dxa" w:w="2068"/>
+          </w:tcPr>
+          <w:p>
+            <w:pPr>
+              <w:spacing w:after="0"/>
+            </w:pPr>
+            <w:r>
+              <w:rPr>
+                <w:rFonts w:ascii="Times New Roman" w:hAnsi="Times New Roman"/>
+                <w:b w:val="0"/>
+                <w:sz w:val="15"/>
+              </w:rPr>
+              <w:t>900</w:t>
+            </w:r>
+          </w:p>
+        </w:tc>
+        <w:tc>
+          <w:tcPr>
+            <w:tcW w:type="dxa" w:w="2068"/>
+          </w:tcPr>
+          <w:p>
+            <w:pPr>
+              <w:spacing w:after="0"/>
+            </w:pPr>
+            <w:r>
+              <w:rPr>
+                <w:rFonts w:ascii="Times New Roman" w:hAnsi="Times New Roman"/>
+                <w:b w:val="0"/>
+                <w:sz w:val="15"/>
+              </w:rPr>
+              <w:t>COMPLETE</w:t>
+            </w:r>
+          </w:p>
+        </w:tc>
+      </w:tr>
+      <w:tr>
+        <w:tc>
+          <w:tcPr>
+            <w:tcW w:type="dxa" w:w="2068"/>
+          </w:tcPr>
+          <w:p>
+            <w:pPr>
+              <w:spacing w:after="0"/>
+            </w:pPr>
+            <w:r>
+              <w:rPr>
+                <w:rFonts w:ascii="Times New Roman" w:hAnsi="Times New Roman"/>
+                <w:b w:val="0"/>
+                <w:sz w:val="15"/>
+              </w:rPr>
+              <w:t>V2</w:t>
+            </w:r>
+          </w:p>
+        </w:tc>
+        <w:tc>
+          <w:tcPr>
+            <w:tcW w:type="dxa" w:w="2068"/>
+          </w:tcPr>
+          <w:p>
+            <w:pPr>
+              <w:spacing w:after="0"/>
+            </w:pPr>
+            <w:r>
+              <w:rPr>
+                <w:rFonts w:ascii="Times New Roman" w:hAnsi="Times New Roman"/>
+                <w:b w:val="0"/>
+                <w:sz w:val="15"/>
+              </w:rPr>
+              <w:t>Kathbath</w:t>
+            </w:r>
+          </w:p>
+        </w:tc>
+        <w:tc>
+          <w:tcPr>
+            <w:tcW w:type="dxa" w:w="2068"/>
+          </w:tcPr>
+          <w:p>
+            <w:pPr>
+              <w:spacing w:after="0"/>
+            </w:pPr>
+            <w:r>
+              <w:rPr>
+                <w:rFonts w:ascii="Times New Roman" w:hAnsi="Times New Roman"/>
+                <w:b w:val="0"/>
+                <w:sz w:val="15"/>
+              </w:rPr>
+              <w:t>REAL</w:t>
+            </w:r>
+          </w:p>
+        </w:tc>
+        <w:tc>
+          <w:tcPr>
+            <w:tcW w:type="dxa" w:w="2068"/>
+          </w:tcPr>
+          <w:p>
+            <w:pPr>
+              <w:spacing w:after="0"/>
+            </w:pPr>
+            <w:r>
+              <w:rPr>
+                <w:rFonts w:ascii="Times New Roman" w:hAnsi="Times New Roman"/>
+                <w:b w:val="0"/>
+                <w:sz w:val="15"/>
+              </w:rPr>
+              <w:t>1,177</w:t>
+            </w:r>
+          </w:p>
+        </w:tc>
+        <w:tc>
+          <w:tcPr>
+            <w:tcW w:type="dxa" w:w="2068"/>
+          </w:tcPr>
+          <w:p>
+            <w:pPr>
+              <w:spacing w:after="0"/>
+            </w:pPr>
+            <w:r>
+              <w:rPr>
+                <w:rFonts w:ascii="Times New Roman" w:hAnsi="Times New Roman"/>
+                <w:b w:val="0"/>
+                <w:sz w:val="15"/>
+              </w:rPr>
+              <w:t>PARTIAL</w:t>
+            </w:r>
+          </w:p>
+        </w:tc>
+      </w:tr>
+      <w:tr>
+        <w:tc>
+          <w:tcPr>
+            <w:tcW w:type="dxa" w:w="2068"/>
+          </w:tcPr>
+          <w:p>
+            <w:pPr>
+              <w:spacing w:after="0"/>
+            </w:pPr>
+            <w:r>
+              <w:rPr>
+                <w:rFonts w:ascii="Times New Roman" w:hAnsi="Times New Roman"/>
+                <w:b w:val="0"/>
+                <w:sz w:val="15"/>
+              </w:rPr>
+              <w:t>V2</w:t>
+            </w:r>
+          </w:p>
+        </w:tc>
+        <w:tc>
+          <w:tcPr>
+            <w:tcW w:type="dxa" w:w="2068"/>
+          </w:tcPr>
+          <w:p>
+            <w:pPr>
+              <w:spacing w:after="0"/>
+            </w:pPr>
+            <w:r>
+              <w:rPr>
+                <w:rFonts w:ascii="Times New Roman" w:hAnsi="Times New Roman"/>
+                <w:b w:val="0"/>
+                <w:sz w:val="15"/>
+              </w:rPr>
+              <w:t>IndicSynth</w:t>
+            </w:r>
+          </w:p>
+        </w:tc>
+        <w:tc>
+          <w:tcPr>
+            <w:tcW w:type="dxa" w:w="2068"/>
+          </w:tcPr>
+          <w:p>
+            <w:pPr>
+              <w:spacing w:after="0"/>
+            </w:pPr>
+            <w:r>
+              <w:rPr>
+                <w:rFonts w:ascii="Times New Roman" w:hAnsi="Times New Roman"/>
+                <w:b w:val="0"/>
+                <w:sz w:val="15"/>
+              </w:rPr>
+              <w:t>FAKE</w:t>
+            </w:r>
+          </w:p>
+        </w:tc>
+        <w:tc>
+          <w:tcPr>
+            <w:tcW w:type="dxa" w:w="2068"/>
+          </w:tcPr>
+          <w:p>
+            <w:pPr>
+              <w:spacing w:after="0"/>
+            </w:pPr>
+            <w:r>
+              <w:rPr>
+                <w:rFonts w:ascii="Times New Roman" w:hAnsi="Times New Roman"/>
+                <w:b w:val="0"/>
+                <w:sz w:val="15"/>
+              </w:rPr>
+              <w:t>1,169</w:t>
+            </w:r>
+          </w:p>
+        </w:tc>
+        <w:tc>
+          <w:tcPr>
+            <w:tcW w:type="dxa" w:w="2068"/>
+          </w:tcPr>
+          <w:p>
+            <w:pPr>
+              <w:spacing w:after="0"/>
+            </w:pPr>
+            <w:r>
+              <w:rPr>
+                <w:rFonts w:ascii="Times New Roman" w:hAnsi="Times New Roman"/>
+                <w:b w:val="0"/>
+                <w:sz w:val="15"/>
+              </w:rPr>
+              <w:t>PARTIAL</w:t>
+            </w:r>
+          </w:p>
+        </w:tc>
+      </w:tr>
+      <w:tr>
+        <w:tc>
+          <w:tcPr>
+            <w:tcW w:type="dxa" w:w="2068"/>
+          </w:tcPr>
+          <w:p>
+            <w:pPr>
+              <w:spacing w:after="0"/>
+            </w:pPr>
+            <w:r>
+              <w:rPr>
+                <w:rFonts w:ascii="Times New Roman" w:hAnsi="Times New Roman"/>
+                <w:b w:val="0"/>
+                <w:sz w:val="15"/>
+              </w:rPr>
+              <w:t>V2</w:t>
+            </w:r>
+          </w:p>
+        </w:tc>
+        <w:tc>
+          <w:tcPr>
+            <w:tcW w:type="dxa" w:w="2068"/>
+          </w:tcPr>
+          <w:p>
+            <w:pPr>
+              <w:spacing w:after="0"/>
+            </w:pPr>
+            <w:r>
+              <w:rPr>
+                <w:rFonts w:ascii="Times New Roman" w:hAnsi="Times New Roman"/>
+                <w:b w:val="0"/>
+                <w:sz w:val="15"/>
+              </w:rPr>
+              <w:t>FLEURS</w:t>
+            </w:r>
+          </w:p>
+        </w:tc>
+        <w:tc>
+          <w:tcPr>
+            <w:tcW w:type="dxa" w:w="2068"/>
+          </w:tcPr>
+          <w:p>
+            <w:pPr>
+              <w:spacing w:after="0"/>
+            </w:pPr>
+            <w:r>
+              <w:rPr>
+                <w:rFonts w:ascii="Times New Roman" w:hAnsi="Times New Roman"/>
+                <w:b w:val="0"/>
+                <w:sz w:val="15"/>
+              </w:rPr>
+              <w:t>REAL</w:t>
+            </w:r>
+          </w:p>
+        </w:tc>
+        <w:tc>
+          <w:tcPr>
+            <w:tcW w:type="dxa" w:w="2068"/>
+          </w:tcPr>
+          <w:p>
+            <w:pPr>
+              <w:spacing w:after="0"/>
+            </w:pPr>
+            <w:r>
+              <w:rPr>
+                <w:rFonts w:ascii="Times New Roman" w:hAnsi="Times New Roman"/>
+                <w:b w:val="0"/>
+                <w:sz w:val="15"/>
+              </w:rPr>
+              <w:t>50</w:t>
+            </w:r>
+          </w:p>
+        </w:tc>
+        <w:tc>
+          <w:tcPr>
+            <w:tcW w:type="dxa" w:w="2068"/>
+          </w:tcPr>
+          <w:p>
+            <w:pPr>
+              <w:spacing w:after="0"/>
+            </w:pPr>
+            <w:r>
+              <w:rPr>
+                <w:rFonts w:ascii="Times New Roman" w:hAnsi="Times New Roman"/>
+                <w:b w:val="0"/>
+                <w:sz w:val="15"/>
+              </w:rPr>
+              <w:t>PARTIAL</w:t>
+            </w:r>
+          </w:p>
+        </w:tc>
+      </w:tr>
+    </w:tbl>
+    <w:p>
+      <w:pPr>
+        <w:jc w:val="center"/>
+      </w:pPr>
+      <w:r>
+        <w:rPr>
+          <w:b/>
+          <w:sz w:val="16"/>
+        </w:rPr>
+        <w:t>TABLE II. SPEAKER-DISJOINT V1 PARTITIONS</w:t>
       </w:r>
     </w:p>
     <w:tbl>
@@ -269,7 +857,7 @@
                 <w:b/>
                 <w:sz w:val="15"/>
               </w:rPr>
-              <w:t>Selection role</w:t>
+              <w:t>Role</w:t>
             </w:r>
           </w:p>
         </w:tc>
@@ -381,7 +969,7 @@
                 <w:b w:val="0"/>
                 <w:sz w:val="15"/>
               </w:rPr>
-              <w:t>Checkpoint/calibration</w:t>
+              <w:t>Checkpoint and calibration selection</w:t>
             </w:r>
           </w:p>
         </w:tc>
@@ -454,7 +1042,7 @@
           <w:b/>
           <w:sz w:val="20"/>
         </w:rPr>
-        <w:t>IV. SYSTEM AND METHOD</w:t>
+        <w:t>IV. METHODOLOGY</w:t>
       </w:r>
     </w:p>
     <w:p>
@@ -505,7 +1093,20 @@
         <w:rPr>
           <w:sz w:val="16"/>
         </w:rPr>
-        <w:t>Fig. 1. VaaniQ software architecture.</w:t>
+        <w:t>Fig. 1. VaaniQ software architecture. Pipeline: audio ? preprocess ? acoustic or frozen XLS-R path ? AASIST-compatible head ? calibration ? verdict.</w:t>
+      </w:r>
+    </w:p>
+    <w:p>
+      <w:pPr>
+        <w:spacing w:before="60" w:after="20"/>
+      </w:pPr>
+      <w:r>
+        <w:rPr>
+          <w:rFonts w:ascii="Times New Roman" w:hAnsi="Times New Roman"/>
+          <w:i/>
+          <w:sz w:val="20"/>
+        </w:rPr>
+        <w:t>A. Acoustic Baseline V1</w:t>
       </w:r>
     </w:p>
     <w:p>
@@ -515,7 +1116,20 @@
         <w:jc w:val="both"/>
       </w:pPr>
       <w:r>
-        <w:t>Audio is decoded, converted to mono 16 kHz, peak-normalized, and bounded in duration. The measured subset uses a deterministic 1024-dimensional acoustic embedding and an AASIST-compatible NumPy classification head. Validation accuracy, followed by EER, selects the checkpoint. Per-language and per-condition temperature scaling is fitted only on validation logits.</w:t>
+        <w:t>Baseline V1 uses a deterministic 1024-D acoustic embedding and an AASIST-compatible NumPy classification head. It is not canonical AASIST and not XLS-R. The decision threshold is 0.5 on the fake softmax score. Label 0 is REAL/bonafide, label 1 is FAKE/spoof, and higher score_fake means higher probability of FAKE. Logit order is [real, fake].</w:t>
+      </w:r>
+    </w:p>
+    <w:p>
+      <w:pPr>
+        <w:spacing w:before="60" w:after="20"/>
+      </w:pPr>
+      <w:r>
+        <w:rPr>
+          <w:rFonts w:ascii="Times New Roman" w:hAnsi="Times New Roman"/>
+          <w:i/>
+          <w:sz w:val="20"/>
+        </w:rPr>
+        <w:t>B. Frozen XLS-R Main</w:t>
       </w:r>
     </w:p>
     <w:p>
@@ -525,7 +1139,53 @@
         <w:jc w:val="both"/>
       </w:pPr>
       <w:r>
-        <w:t>The implementation exposes upload and live-microphone inference through FastAPI and a strict TypeScript React interface. Reliability diagrams, coverage curves, spectrograms, temporal attention, frequency-band masking, and compression views support interpretation.</w:t>
+        <w:t>The separate main path uses frozen facebook/wav2vec2-xls-r-300m, last-layer mean pooling, cached features, and a lightweight trainable AASIST-compatible head. The backbone is not updated. Production calibration for this path is global temperature scaling selected on validation.</w:t>
+      </w:r>
+    </w:p>
+    <w:p>
+      <w:pPr>
+        <w:spacing w:before="60" w:after="20"/>
+      </w:pPr>
+      <w:r>
+        <w:rPr>
+          <w:rFonts w:ascii="Times New Roman" w:hAnsi="Times New Roman"/>
+          <w:i/>
+          <w:sz w:val="20"/>
+        </w:rPr>
+        <w:t>C. Baselines and Controls</w:t>
+      </w:r>
+    </w:p>
+    <w:p>
+      <w:pPr>
+        <w:spacing w:after="40" w:line="240" w:lineRule="auto"/>
+        <w:ind w:firstLine="230"/>
+        <w:jc w:val="both"/>
+      </w:pPr>
+      <w:r>
+        <w:t>LFCC-GMM is a complete weak baseline. A RawNet2-style approximate baseline is complete but must not be called faithful RawNet2; faithful RawNet2 remains PENDING. An English-only ASVspoof LA control is evaluated on the same Indic held-out test.</w:t>
+      </w:r>
+    </w:p>
+    <w:p>
+      <w:pPr>
+        <w:spacing w:before="60" w:after="20"/>
+      </w:pPr>
+      <w:r>
+        <w:rPr>
+          <w:rFonts w:ascii="Times New Roman" w:hAnsi="Times New Roman"/>
+          <w:i/>
+          <w:sz w:val="20"/>
+        </w:rPr>
+        <w:t>D. Compression and Evaluation Protocol</w:t>
+      </w:r>
+    </w:p>
+    <w:p>
+      <w:pPr>
+        <w:spacing w:after="40" w:line="240" w:lineRule="auto"/>
+        <w:ind w:firstLine="230"/>
+        <w:jc w:val="both"/>
+      </w:pPr>
+      <w:r>
+        <w:t>ffmpeg/libopus at 16 kbps provides a WhatsApp-style Opus simulation. It is not audio transported through the WhatsApp service. EER, ROC-AUC, and normalized min-DCF use the same score direction. min-DCF uses P_target=0.05, C_miss=1, C_fa=1, with normalization denominator P_target × C_miss = 0.05.</w:t>
       </w:r>
     </w:p>
     <w:p>
@@ -551,7 +1211,7 @@
           <w:b/>
           <w:sz w:val="16"/>
         </w:rPr>
-        <w:t>TABLE II. OVERALL SPEAKER-DISJOINT TEST RESULTS</w:t>
+        <w:t>TABLE III. PRIMARY HELD-OUT MODEL COMPARISON ON THE SAME V1 TEST SET</w:t>
       </w:r>
     </w:p>
     <w:tbl>
@@ -561,13 +1221,20 @@
         <w:tblLook w:firstColumn="1" w:firstRow="1" w:lastColumn="0" w:lastRow="0" w:noHBand="0" w:noVBand="1" w:val="04A0"/>
       </w:tblPr>
       <w:tblGrid>
-        <w:gridCol w:w="5170"/>
-        <w:gridCol w:w="5170"/>
+        <w:gridCol w:w="1149"/>
+        <w:gridCol w:w="1149"/>
+        <w:gridCol w:w="1149"/>
+        <w:gridCol w:w="1149"/>
+        <w:gridCol w:w="1149"/>
+        <w:gridCol w:w="1149"/>
+        <w:gridCol w:w="1149"/>
+        <w:gridCol w:w="1149"/>
+        <w:gridCol w:w="1149"/>
       </w:tblGrid>
       <w:tr>
         <w:tc>
           <w:tcPr>
-            <w:tcW w:type="dxa" w:w="5170"/>
+            <w:tcW w:type="dxa" w:w="1149"/>
           </w:tcPr>
           <w:p>
             <w:pPr>
@@ -579,343 +1246,13 @@
                 <w:b/>
                 <w:sz w:val="15"/>
               </w:rPr>
-              <w:t>Metric</w:t>
+              <w:t>Model</w:t>
             </w:r>
           </w:p>
         </w:tc>
         <w:tc>
           <w:tcPr>
-            <w:tcW w:type="dxa" w:w="5170"/>
-          </w:tcPr>
-          <w:p>
-            <w:pPr>
-              <w:spacing w:after="0"/>
-            </w:pPr>
-            <w:r>
-              <w:rPr>
-                <w:rFonts w:ascii="Times New Roman" w:hAnsi="Times New Roman"/>
-                <w:b/>
-                <w:sz w:val="15"/>
-              </w:rPr>
-              <w:t>Held-out value</w:t>
-            </w:r>
-          </w:p>
-        </w:tc>
-      </w:tr>
-      <w:tr>
-        <w:tc>
-          <w:tcPr>
-            <w:tcW w:type="dxa" w:w="5170"/>
-          </w:tcPr>
-          <w:p>
-            <w:pPr>
-              <w:spacing w:after="0"/>
-            </w:pPr>
-            <w:r>
-              <w:rPr>
-                <w:rFonts w:ascii="Times New Roman" w:hAnsi="Times New Roman"/>
-                <w:b w:val="0"/>
-                <w:sz w:val="15"/>
-              </w:rPr>
-              <w:t>Accuracy</w:t>
-            </w:r>
-          </w:p>
-        </w:tc>
-        <w:tc>
-          <w:tcPr>
-            <w:tcW w:type="dxa" w:w="5170"/>
-          </w:tcPr>
-          <w:p>
-            <w:pPr>
-              <w:spacing w:after="0"/>
-            </w:pPr>
-            <w:r>
-              <w:rPr>
-                <w:rFonts w:ascii="Times New Roman" w:hAnsi="Times New Roman"/>
-                <w:b w:val="0"/>
-                <w:sz w:val="15"/>
-              </w:rPr>
-              <w:t>91.6%</w:t>
-            </w:r>
-          </w:p>
-        </w:tc>
-      </w:tr>
-      <w:tr>
-        <w:tc>
-          <w:tcPr>
-            <w:tcW w:type="dxa" w:w="5170"/>
-          </w:tcPr>
-          <w:p>
-            <w:pPr>
-              <w:spacing w:after="0"/>
-            </w:pPr>
-            <w:r>
-              <w:rPr>
-                <w:rFonts w:ascii="Times New Roman" w:hAnsi="Times New Roman"/>
-                <w:b w:val="0"/>
-                <w:sz w:val="15"/>
-              </w:rPr>
-              <w:t>Precision</w:t>
-            </w:r>
-          </w:p>
-        </w:tc>
-        <w:tc>
-          <w:tcPr>
-            <w:tcW w:type="dxa" w:w="5170"/>
-          </w:tcPr>
-          <w:p>
-            <w:pPr>
-              <w:spacing w:after="0"/>
-            </w:pPr>
-            <w:r>
-              <w:rPr>
-                <w:rFonts w:ascii="Times New Roman" w:hAnsi="Times New Roman"/>
-                <w:b w:val="0"/>
-                <w:sz w:val="15"/>
-              </w:rPr>
-              <w:t>85.5%</w:t>
-            </w:r>
-          </w:p>
-        </w:tc>
-      </w:tr>
-      <w:tr>
-        <w:tc>
-          <w:tcPr>
-            <w:tcW w:type="dxa" w:w="5170"/>
-          </w:tcPr>
-          <w:p>
-            <w:pPr>
-              <w:spacing w:after="0"/>
-            </w:pPr>
-            <w:r>
-              <w:rPr>
-                <w:rFonts w:ascii="Times New Roman" w:hAnsi="Times New Roman"/>
-                <w:b w:val="0"/>
-                <w:sz w:val="15"/>
-              </w:rPr>
-              <w:t>Recall</w:t>
-            </w:r>
-          </w:p>
-        </w:tc>
-        <w:tc>
-          <w:tcPr>
-            <w:tcW w:type="dxa" w:w="5170"/>
-          </w:tcPr>
-          <w:p>
-            <w:pPr>
-              <w:spacing w:after="0"/>
-            </w:pPr>
-            <w:r>
-              <w:rPr>
-                <w:rFonts w:ascii="Times New Roman" w:hAnsi="Times New Roman"/>
-                <w:b w:val="0"/>
-                <w:sz w:val="15"/>
-              </w:rPr>
-              <w:t>98.1%</w:t>
-            </w:r>
-          </w:p>
-        </w:tc>
-      </w:tr>
-      <w:tr>
-        <w:tc>
-          <w:tcPr>
-            <w:tcW w:type="dxa" w:w="5170"/>
-          </w:tcPr>
-          <w:p>
-            <w:pPr>
-              <w:spacing w:after="0"/>
-            </w:pPr>
-            <w:r>
-              <w:rPr>
-                <w:rFonts w:ascii="Times New Roman" w:hAnsi="Times New Roman"/>
-                <w:b w:val="0"/>
-                <w:sz w:val="15"/>
-              </w:rPr>
-              <w:t>F1</w:t>
-            </w:r>
-          </w:p>
-        </w:tc>
-        <w:tc>
-          <w:tcPr>
-            <w:tcW w:type="dxa" w:w="5170"/>
-          </w:tcPr>
-          <w:p>
-            <w:pPr>
-              <w:spacing w:after="0"/>
-            </w:pPr>
-            <w:r>
-              <w:rPr>
-                <w:rFonts w:ascii="Times New Roman" w:hAnsi="Times New Roman"/>
-                <w:b w:val="0"/>
-                <w:sz w:val="15"/>
-              </w:rPr>
-              <w:t>91.4%</w:t>
-            </w:r>
-          </w:p>
-        </w:tc>
-      </w:tr>
-      <w:tr>
-        <w:tc>
-          <w:tcPr>
-            <w:tcW w:type="dxa" w:w="5170"/>
-          </w:tcPr>
-          <w:p>
-            <w:pPr>
-              <w:spacing w:after="0"/>
-            </w:pPr>
-            <w:r>
-              <w:rPr>
-                <w:rFonts w:ascii="Times New Roman" w:hAnsi="Times New Roman"/>
-                <w:b w:val="0"/>
-                <w:sz w:val="15"/>
-              </w:rPr>
-              <w:t>EER</w:t>
-            </w:r>
-          </w:p>
-        </w:tc>
-        <w:tc>
-          <w:tcPr>
-            <w:tcW w:type="dxa" w:w="5170"/>
-          </w:tcPr>
-          <w:p>
-            <w:pPr>
-              <w:spacing w:after="0"/>
-            </w:pPr>
-            <w:r>
-              <w:rPr>
-                <w:rFonts w:ascii="Times New Roman" w:hAnsi="Times New Roman"/>
-                <w:b w:val="0"/>
-                <w:sz w:val="15"/>
-              </w:rPr>
-              <w:t>6.6%</w:t>
-            </w:r>
-          </w:p>
-        </w:tc>
-      </w:tr>
-      <w:tr>
-        <w:tc>
-          <w:tcPr>
-            <w:tcW w:type="dxa" w:w="5170"/>
-          </w:tcPr>
-          <w:p>
-            <w:pPr>
-              <w:spacing w:after="0"/>
-            </w:pPr>
-            <w:r>
-              <w:rPr>
-                <w:rFonts w:ascii="Times New Roman" w:hAnsi="Times New Roman"/>
-                <w:b w:val="0"/>
-                <w:sz w:val="15"/>
-              </w:rPr>
-              <w:t>min-DCF</w:t>
-            </w:r>
-          </w:p>
-        </w:tc>
-        <w:tc>
-          <w:tcPr>
-            <w:tcW w:type="dxa" w:w="5170"/>
-          </w:tcPr>
-          <w:p>
-            <w:pPr>
-              <w:spacing w:after="0"/>
-            </w:pPr>
-            <w:r>
-              <w:rPr>
-                <w:rFonts w:ascii="Times New Roman" w:hAnsi="Times New Roman"/>
-                <w:b w:val="0"/>
-                <w:sz w:val="15"/>
-              </w:rPr>
-              <w:t>0.784</w:t>
-            </w:r>
-          </w:p>
-        </w:tc>
-      </w:tr>
-      <w:tr>
-        <w:tc>
-          <w:tcPr>
-            <w:tcW w:type="dxa" w:w="5170"/>
-          </w:tcPr>
-          <w:p>
-            <w:pPr>
-              <w:spacing w:after="0"/>
-            </w:pPr>
-            <w:r>
-              <w:rPr>
-                <w:rFonts w:ascii="Times New Roman" w:hAnsi="Times New Roman"/>
-                <w:b w:val="0"/>
-                <w:sz w:val="15"/>
-              </w:rPr>
-              <w:t>ROC-AUC</w:t>
-            </w:r>
-          </w:p>
-        </w:tc>
-        <w:tc>
-          <w:tcPr>
-            <w:tcW w:type="dxa" w:w="5170"/>
-          </w:tcPr>
-          <w:p>
-            <w:pPr>
-              <w:spacing w:after="0"/>
-            </w:pPr>
-            <w:r>
-              <w:rPr>
-                <w:rFonts w:ascii="Times New Roman" w:hAnsi="Times New Roman"/>
-                <w:b w:val="0"/>
-                <w:sz w:val="15"/>
-              </w:rPr>
-              <w:t>0.973</w:t>
-            </w:r>
-          </w:p>
-        </w:tc>
-      </w:tr>
-    </w:tbl>
-    <w:p>
-      <w:pPr>
-        <w:jc w:val="center"/>
-      </w:pPr>
-      <w:r>
-        <w:rPr>
-          <w:b/>
-          <w:sz w:val="16"/>
-        </w:rPr>
-        <w:t>TABLE III. PER-LANGUAGE HELD-OUT RESULTS</w:t>
-      </w:r>
-    </w:p>
-    <w:tbl>
-      <w:tblPr>
-        <w:tblStyle w:val="TableGrid"/>
-        <w:tblW w:type="auto" w:w="0"/>
-        <w:tblLook w:firstColumn="1" w:firstRow="1" w:lastColumn="0" w:lastRow="0" w:noHBand="0" w:noVBand="1" w:val="04A0"/>
-      </w:tblPr>
-      <w:tblGrid>
-        <w:gridCol w:w="2068"/>
-        <w:gridCol w:w="2068"/>
-        <w:gridCol w:w="2068"/>
-        <w:gridCol w:w="2068"/>
-        <w:gridCol w:w="2068"/>
-      </w:tblGrid>
-      <w:tr>
-        <w:tc>
-          <w:tcPr>
-            <w:tcW w:type="dxa" w:w="2068"/>
-          </w:tcPr>
-          <w:p>
-            <w:pPr>
-              <w:spacing w:after="0"/>
-            </w:pPr>
-            <w:r>
-              <w:rPr>
-                <w:rFonts w:ascii="Times New Roman" w:hAnsi="Times New Roman"/>
-                <w:b/>
-                <w:sz w:val="15"/>
-              </w:rPr>
-              <w:t>Language</w:t>
-            </w:r>
-          </w:p>
-        </w:tc>
-        <w:tc>
-          <w:tcPr>
-            <w:tcW w:type="dxa" w:w="2068"/>
+            <w:tcW w:type="dxa" w:w="1149"/>
           </w:tcPr>
           <w:p>
             <w:pPr>
@@ -933,7 +1270,7 @@
         </w:tc>
         <w:tc>
           <w:tcPr>
-            <w:tcW w:type="dxa" w:w="2068"/>
+            <w:tcW w:type="dxa" w:w="1149"/>
           </w:tcPr>
           <w:p>
             <w:pPr>
@@ -951,7 +1288,43 @@
         </w:tc>
         <w:tc>
           <w:tcPr>
-            <w:tcW w:type="dxa" w:w="2068"/>
+            <w:tcW w:type="dxa" w:w="1149"/>
+          </w:tcPr>
+          <w:p>
+            <w:pPr>
+              <w:spacing w:after="0"/>
+            </w:pPr>
+            <w:r>
+              <w:rPr>
+                <w:rFonts w:ascii="Times New Roman" w:hAnsi="Times New Roman"/>
+                <w:b/>
+                <w:sz w:val="15"/>
+              </w:rPr>
+              <w:t>Precision</w:t>
+            </w:r>
+          </w:p>
+        </w:tc>
+        <w:tc>
+          <w:tcPr>
+            <w:tcW w:type="dxa" w:w="1149"/>
+          </w:tcPr>
+          <w:p>
+            <w:pPr>
+              <w:spacing w:after="0"/>
+            </w:pPr>
+            <w:r>
+              <w:rPr>
+                <w:rFonts w:ascii="Times New Roman" w:hAnsi="Times New Roman"/>
+                <w:b/>
+                <w:sz w:val="15"/>
+              </w:rPr>
+              <w:t>Recall</w:t>
+            </w:r>
+          </w:p>
+        </w:tc>
+        <w:tc>
+          <w:tcPr>
+            <w:tcW w:type="dxa" w:w="1149"/>
           </w:tcPr>
           <w:p>
             <w:pPr>
@@ -969,7 +1342,7 @@
         </w:tc>
         <w:tc>
           <w:tcPr>
-            <w:tcW w:type="dxa" w:w="2068"/>
+            <w:tcW w:type="dxa" w:w="1149"/>
           </w:tcPr>
           <w:p>
             <w:pPr>
@@ -985,11 +1358,47 @@
             </w:r>
           </w:p>
         </w:tc>
+        <w:tc>
+          <w:tcPr>
+            <w:tcW w:type="dxa" w:w="1149"/>
+          </w:tcPr>
+          <w:p>
+            <w:pPr>
+              <w:spacing w:after="0"/>
+            </w:pPr>
+            <w:r>
+              <w:rPr>
+                <w:rFonts w:ascii="Times New Roman" w:hAnsi="Times New Roman"/>
+                <w:b/>
+                <w:sz w:val="15"/>
+              </w:rPr>
+              <w:t>ROC-AUC</w:t>
+            </w:r>
+          </w:p>
+        </w:tc>
+        <w:tc>
+          <w:tcPr>
+            <w:tcW w:type="dxa" w:w="1149"/>
+          </w:tcPr>
+          <w:p>
+            <w:pPr>
+              <w:spacing w:after="0"/>
+            </w:pPr>
+            <w:r>
+              <w:rPr>
+                <w:rFonts w:ascii="Times New Roman" w:hAnsi="Times New Roman"/>
+                <w:b/>
+                <w:sz w:val="15"/>
+              </w:rPr>
+              <w:t>min-DCF</w:t>
+            </w:r>
+          </w:p>
+        </w:tc>
       </w:tr>
       <w:tr>
         <w:tc>
           <w:tcPr>
-            <w:tcW w:type="dxa" w:w="2068"/>
+            <w:tcW w:type="dxa" w:w="1149"/>
           </w:tcPr>
           <w:p>
             <w:pPr>
@@ -1001,13 +1410,13 @@
                 <w:b w:val="0"/>
                 <w:sz w:val="15"/>
               </w:rPr>
-              <w:t>Hindi</w:t>
+              <w:t>Acoustic Baseline V1</w:t>
             </w:r>
           </w:p>
         </w:tc>
         <w:tc>
           <w:tcPr>
-            <w:tcW w:type="dxa" w:w="2068"/>
+            <w:tcW w:type="dxa" w:w="1149"/>
           </w:tcPr>
           <w:p>
             <w:pPr>
@@ -1019,13 +1428,13 @@
                 <w:b w:val="0"/>
                 <w:sz w:val="15"/>
               </w:rPr>
-              <w:t>222</w:t>
+              <w:t>584</w:t>
             </w:r>
           </w:p>
         </w:tc>
         <w:tc>
           <w:tcPr>
-            <w:tcW w:type="dxa" w:w="2068"/>
+            <w:tcW w:type="dxa" w:w="1149"/>
           </w:tcPr>
           <w:p>
             <w:pPr>
@@ -1037,13 +1446,13 @@
                 <w:b w:val="0"/>
                 <w:sz w:val="15"/>
               </w:rPr>
-              <w:t>91.0%</w:t>
+              <w:t>91.61%</w:t>
             </w:r>
           </w:p>
         </w:tc>
         <w:tc>
           <w:tcPr>
-            <w:tcW w:type="dxa" w:w="2068"/>
+            <w:tcW w:type="dxa" w:w="1149"/>
           </w:tcPr>
           <w:p>
             <w:pPr>
@@ -1055,13 +1464,13 @@
                 <w:b w:val="0"/>
                 <w:sz w:val="15"/>
               </w:rPr>
-              <w:t>88.8%</w:t>
+              <w:t>85.48%</w:t>
             </w:r>
           </w:p>
         </w:tc>
         <w:tc>
           <w:tcPr>
-            <w:tcW w:type="dxa" w:w="2068"/>
+            <w:tcW w:type="dxa" w:w="1149"/>
           </w:tcPr>
           <w:p>
             <w:pPr>
@@ -1073,15 +1482,13 @@
                 <w:b w:val="0"/>
                 <w:sz w:val="15"/>
               </w:rPr>
-              <w:t>7.0%</w:t>
+              <w:t>98.11%</w:t>
             </w:r>
           </w:p>
         </w:tc>
-      </w:tr>
-      <w:tr>
         <w:tc>
           <w:tcPr>
-            <w:tcW w:type="dxa" w:w="2068"/>
+            <w:tcW w:type="dxa" w:w="1149"/>
           </w:tcPr>
           <w:p>
             <w:pPr>
@@ -1093,13 +1500,13 @@
                 <w:b w:val="0"/>
                 <w:sz w:val="15"/>
               </w:rPr>
-              <w:t>Marathi</w:t>
+              <w:t>91.36%</w:t>
             </w:r>
           </w:p>
         </w:tc>
         <w:tc>
           <w:tcPr>
-            <w:tcW w:type="dxa" w:w="2068"/>
+            <w:tcW w:type="dxa" w:w="1149"/>
           </w:tcPr>
           <w:p>
             <w:pPr>
@@ -1111,13 +1518,13 @@
                 <w:b w:val="0"/>
                 <w:sz w:val="15"/>
               </w:rPr>
-              <w:t>164</w:t>
+              <w:t>6.56%</w:t>
             </w:r>
           </w:p>
         </w:tc>
         <w:tc>
           <w:tcPr>
-            <w:tcW w:type="dxa" w:w="2068"/>
+            <w:tcW w:type="dxa" w:w="1149"/>
           </w:tcPr>
           <w:p>
             <w:pPr>
@@ -1129,13 +1536,13 @@
                 <w:b w:val="0"/>
                 <w:sz w:val="15"/>
               </w:rPr>
-              <w:t>93.3%</w:t>
+              <w:t>0.9729</w:t>
             </w:r>
           </w:p>
         </w:tc>
         <w:tc>
           <w:tcPr>
-            <w:tcW w:type="dxa" w:w="2068"/>
+            <w:tcW w:type="dxa" w:w="1149"/>
           </w:tcPr>
           <w:p>
             <w:pPr>
@@ -1147,13 +1554,15 @@
                 <w:b w:val="0"/>
                 <w:sz w:val="15"/>
               </w:rPr>
-              <w:t>95.2%</w:t>
+              <w:t>0.7841</w:t>
             </w:r>
           </w:p>
         </w:tc>
+      </w:tr>
+      <w:tr>
         <w:tc>
           <w:tcPr>
-            <w:tcW w:type="dxa" w:w="2068"/>
+            <w:tcW w:type="dxa" w:w="1149"/>
           </w:tcPr>
           <w:p>
             <w:pPr>
@@ -1165,15 +1574,13 @@
                 <w:b w:val="0"/>
                 <w:sz w:val="15"/>
               </w:rPr>
-              <w:t>6.2%</w:t>
+              <w:t>Frozen XLS-R main</w:t>
             </w:r>
           </w:p>
         </w:tc>
-      </w:tr>
-      <w:tr>
         <w:tc>
           <w:tcPr>
-            <w:tcW w:type="dxa" w:w="2068"/>
+            <w:tcW w:type="dxa" w:w="1149"/>
           </w:tcPr>
           <w:p>
             <w:pPr>
@@ -1185,13 +1592,13 @@
                 <w:b w:val="0"/>
                 <w:sz w:val="15"/>
               </w:rPr>
-              <w:t>Tamil</w:t>
+              <w:t>584</w:t>
             </w:r>
           </w:p>
         </w:tc>
         <w:tc>
           <w:tcPr>
-            <w:tcW w:type="dxa" w:w="2068"/>
+            <w:tcW w:type="dxa" w:w="1149"/>
           </w:tcPr>
           <w:p>
             <w:pPr>
@@ -1203,13 +1610,13 @@
                 <w:b w:val="0"/>
                 <w:sz w:val="15"/>
               </w:rPr>
-              <w:t>198</w:t>
+              <w:t>92.12%</w:t>
             </w:r>
           </w:p>
         </w:tc>
         <w:tc>
           <w:tcPr>
-            <w:tcW w:type="dxa" w:w="2068"/>
+            <w:tcW w:type="dxa" w:w="1149"/>
           </w:tcPr>
           <w:p>
             <w:pPr>
@@ -1221,13 +1628,13 @@
                 <w:b w:val="0"/>
                 <w:sz w:val="15"/>
               </w:rPr>
-              <w:t>90.9%</w:t>
+              <w:t>88.38%</w:t>
             </w:r>
           </w:p>
         </w:tc>
         <w:tc>
           <w:tcPr>
-            <w:tcW w:type="dxa" w:w="2068"/>
+            <w:tcW w:type="dxa" w:w="1149"/>
           </w:tcPr>
           <w:p>
             <w:pPr>
@@ -1239,13 +1646,13 @@
                 <w:b w:val="0"/>
                 <w:sz w:val="15"/>
               </w:rPr>
-              <w:t>88.8%</w:t>
+              <w:t>95.08%</w:t>
             </w:r>
           </w:p>
         </w:tc>
         <w:tc>
           <w:tcPr>
-            <w:tcW w:type="dxa" w:w="2068"/>
+            <w:tcW w:type="dxa" w:w="1149"/>
           </w:tcPr>
           <w:p>
             <w:pPr>
@@ -1257,12 +1664,469 @@
                 <w:b w:val="0"/>
                 <w:sz w:val="15"/>
               </w:rPr>
-              <w:t>7.1%</w:t>
+              <w:t>91.61%</w:t>
+            </w:r>
+          </w:p>
+        </w:tc>
+        <w:tc>
+          <w:tcPr>
+            <w:tcW w:type="dxa" w:w="1149"/>
+          </w:tcPr>
+          <w:p>
+            <w:pPr>
+              <w:spacing w:after="0"/>
+            </w:pPr>
+            <w:r>
+              <w:rPr>
+                <w:rFonts w:ascii="Times New Roman" w:hAnsi="Times New Roman"/>
+                <w:b w:val="0"/>
+                <w:sz w:val="15"/>
+              </w:rPr>
+              <w:t>6.88%</w:t>
+            </w:r>
+          </w:p>
+        </w:tc>
+        <w:tc>
+          <w:tcPr>
+            <w:tcW w:type="dxa" w:w="1149"/>
+          </w:tcPr>
+          <w:p>
+            <w:pPr>
+              <w:spacing w:after="0"/>
+            </w:pPr>
+            <w:r>
+              <w:rPr>
+                <w:rFonts w:ascii="Times New Roman" w:hAnsi="Times New Roman"/>
+                <w:b w:val="0"/>
+                <w:sz w:val="15"/>
+              </w:rPr>
+              <w:t>0.9828</w:t>
+            </w:r>
+          </w:p>
+        </w:tc>
+        <w:tc>
+          <w:tcPr>
+            <w:tcW w:type="dxa" w:w="1149"/>
+          </w:tcPr>
+          <w:p>
+            <w:pPr>
+              <w:spacing w:after="0"/>
+            </w:pPr>
+            <w:r>
+              <w:rPr>
+                <w:rFonts w:ascii="Times New Roman" w:hAnsi="Times New Roman"/>
+                <w:b w:val="0"/>
+                <w:sz w:val="15"/>
+              </w:rPr>
+              <w:t>0.3144</w:t>
+            </w:r>
+          </w:p>
+        </w:tc>
+      </w:tr>
+      <w:tr>
+        <w:tc>
+          <w:tcPr>
+            <w:tcW w:type="dxa" w:w="1149"/>
+          </w:tcPr>
+          <w:p>
+            <w:pPr>
+              <w:spacing w:after="0"/>
+            </w:pPr>
+            <w:r>
+              <w:rPr>
+                <w:rFonts w:ascii="Times New Roman" w:hAnsi="Times New Roman"/>
+                <w:b w:val="0"/>
+                <w:sz w:val="15"/>
+              </w:rPr>
+              <w:t>LFCC-GMM</w:t>
+            </w:r>
+          </w:p>
+        </w:tc>
+        <w:tc>
+          <w:tcPr>
+            <w:tcW w:type="dxa" w:w="1149"/>
+          </w:tcPr>
+          <w:p>
+            <w:pPr>
+              <w:spacing w:after="0"/>
+            </w:pPr>
+            <w:r>
+              <w:rPr>
+                <w:rFonts w:ascii="Times New Roman" w:hAnsi="Times New Roman"/>
+                <w:b w:val="0"/>
+                <w:sz w:val="15"/>
+              </w:rPr>
+              <w:t>584</w:t>
+            </w:r>
+          </w:p>
+        </w:tc>
+        <w:tc>
+          <w:tcPr>
+            <w:tcW w:type="dxa" w:w="1149"/>
+          </w:tcPr>
+          <w:p>
+            <w:pPr>
+              <w:spacing w:after="0"/>
+            </w:pPr>
+            <w:r>
+              <w:rPr>
+                <w:rFonts w:ascii="Times New Roman" w:hAnsi="Times New Roman"/>
+                <w:b w:val="0"/>
+                <w:sz w:val="15"/>
+              </w:rPr>
+              <w:t>54.79%</w:t>
+            </w:r>
+          </w:p>
+        </w:tc>
+        <w:tc>
+          <w:tcPr>
+            <w:tcW w:type="dxa" w:w="1149"/>
+          </w:tcPr>
+          <w:p>
+            <w:pPr>
+              <w:spacing w:after="0"/>
+            </w:pPr>
+            <w:r>
+              <w:rPr>
+                <w:rFonts w:ascii="Times New Roman" w:hAnsi="Times New Roman"/>
+                <w:b w:val="0"/>
+                <w:sz w:val="15"/>
+              </w:rPr>
+              <w:t>0.00%</w:t>
+            </w:r>
+          </w:p>
+        </w:tc>
+        <w:tc>
+          <w:tcPr>
+            <w:tcW w:type="dxa" w:w="1149"/>
+          </w:tcPr>
+          <w:p>
+            <w:pPr>
+              <w:spacing w:after="0"/>
+            </w:pPr>
+            <w:r>
+              <w:rPr>
+                <w:rFonts w:ascii="Times New Roman" w:hAnsi="Times New Roman"/>
+                <w:b w:val="0"/>
+                <w:sz w:val="15"/>
+              </w:rPr>
+              <w:t>0.00%</w:t>
+            </w:r>
+          </w:p>
+        </w:tc>
+        <w:tc>
+          <w:tcPr>
+            <w:tcW w:type="dxa" w:w="1149"/>
+          </w:tcPr>
+          <w:p>
+            <w:pPr>
+              <w:spacing w:after="0"/>
+            </w:pPr>
+            <w:r>
+              <w:rPr>
+                <w:rFonts w:ascii="Times New Roman" w:hAnsi="Times New Roman"/>
+                <w:b w:val="0"/>
+                <w:sz w:val="15"/>
+              </w:rPr>
+              <w:t>0.00%</w:t>
+            </w:r>
+          </w:p>
+        </w:tc>
+        <w:tc>
+          <w:tcPr>
+            <w:tcW w:type="dxa" w:w="1149"/>
+          </w:tcPr>
+          <w:p>
+            <w:pPr>
+              <w:spacing w:after="0"/>
+            </w:pPr>
+            <w:r>
+              <w:rPr>
+                <w:rFonts w:ascii="Times New Roman" w:hAnsi="Times New Roman"/>
+                <w:b w:val="0"/>
+                <w:sz w:val="15"/>
+              </w:rPr>
+              <w:t>23.48%</w:t>
+            </w:r>
+          </w:p>
+        </w:tc>
+        <w:tc>
+          <w:tcPr>
+            <w:tcW w:type="dxa" w:w="1149"/>
+          </w:tcPr>
+          <w:p>
+            <w:pPr>
+              <w:spacing w:after="0"/>
+            </w:pPr>
+            <w:r>
+              <w:rPr>
+                <w:rFonts w:ascii="Times New Roman" w:hAnsi="Times New Roman"/>
+                <w:b w:val="0"/>
+                <w:sz w:val="15"/>
+              </w:rPr>
+              <w:t>0.8195</w:t>
+            </w:r>
+          </w:p>
+        </w:tc>
+        <w:tc>
+          <w:tcPr>
+            <w:tcW w:type="dxa" w:w="1149"/>
+          </w:tcPr>
+          <w:p>
+            <w:pPr>
+              <w:spacing w:after="0"/>
+            </w:pPr>
+            <w:r>
+              <w:rPr>
+                <w:rFonts w:ascii="Times New Roman" w:hAnsi="Times New Roman"/>
+                <w:b w:val="0"/>
+                <w:sz w:val="15"/>
+              </w:rPr>
+              <w:t>0.4962</w:t>
+            </w:r>
+          </w:p>
+        </w:tc>
+      </w:tr>
+      <w:tr>
+        <w:tc>
+          <w:tcPr>
+            <w:tcW w:type="dxa" w:w="1149"/>
+          </w:tcPr>
+          <w:p>
+            <w:pPr>
+              <w:spacing w:after="0"/>
+            </w:pPr>
+            <w:r>
+              <w:rPr>
+                <w:rFonts w:ascii="Times New Roman" w:hAnsi="Times New Roman"/>
+                <w:b w:val="0"/>
+                <w:sz w:val="15"/>
+              </w:rPr>
+              <w:t>RawNet2-style approx.</w:t>
+            </w:r>
+          </w:p>
+        </w:tc>
+        <w:tc>
+          <w:tcPr>
+            <w:tcW w:type="dxa" w:w="1149"/>
+          </w:tcPr>
+          <w:p>
+            <w:pPr>
+              <w:spacing w:after="0"/>
+            </w:pPr>
+            <w:r>
+              <w:rPr>
+                <w:rFonts w:ascii="Times New Roman" w:hAnsi="Times New Roman"/>
+                <w:b w:val="0"/>
+                <w:sz w:val="15"/>
+              </w:rPr>
+              <w:t>584</w:t>
+            </w:r>
+          </w:p>
+        </w:tc>
+        <w:tc>
+          <w:tcPr>
+            <w:tcW w:type="dxa" w:w="1149"/>
+          </w:tcPr>
+          <w:p>
+            <w:pPr>
+              <w:spacing w:after="0"/>
+            </w:pPr>
+            <w:r>
+              <w:rPr>
+                <w:rFonts w:ascii="Times New Roman" w:hAnsi="Times New Roman"/>
+                <w:b w:val="0"/>
+                <w:sz w:val="15"/>
+              </w:rPr>
+              <w:t>54.79%</w:t>
+            </w:r>
+          </w:p>
+        </w:tc>
+        <w:tc>
+          <w:tcPr>
+            <w:tcW w:type="dxa" w:w="1149"/>
+          </w:tcPr>
+          <w:p>
+            <w:pPr>
+              <w:spacing w:after="0"/>
+            </w:pPr>
+            <w:r>
+              <w:rPr>
+                <w:rFonts w:ascii="Times New Roman" w:hAnsi="Times New Roman"/>
+                <w:b w:val="0"/>
+                <w:sz w:val="15"/>
+              </w:rPr>
+              <w:t>0.00%</w:t>
+            </w:r>
+          </w:p>
+        </w:tc>
+        <w:tc>
+          <w:tcPr>
+            <w:tcW w:type="dxa" w:w="1149"/>
+          </w:tcPr>
+          <w:p>
+            <w:pPr>
+              <w:spacing w:after="0"/>
+            </w:pPr>
+            <w:r>
+              <w:rPr>
+                <w:rFonts w:ascii="Times New Roman" w:hAnsi="Times New Roman"/>
+                <w:b w:val="0"/>
+                <w:sz w:val="15"/>
+              </w:rPr>
+              <w:t>0.00%</w:t>
+            </w:r>
+          </w:p>
+        </w:tc>
+        <w:tc>
+          <w:tcPr>
+            <w:tcW w:type="dxa" w:w="1149"/>
+          </w:tcPr>
+          <w:p>
+            <w:pPr>
+              <w:spacing w:after="0"/>
+            </w:pPr>
+            <w:r>
+              <w:rPr>
+                <w:rFonts w:ascii="Times New Roman" w:hAnsi="Times New Roman"/>
+                <w:b w:val="0"/>
+                <w:sz w:val="15"/>
+              </w:rPr>
+              <w:t>0.00%</w:t>
+            </w:r>
+          </w:p>
+        </w:tc>
+        <w:tc>
+          <w:tcPr>
+            <w:tcW w:type="dxa" w:w="1149"/>
+          </w:tcPr>
+          <w:p>
+            <w:pPr>
+              <w:spacing w:after="0"/>
+            </w:pPr>
+            <w:r>
+              <w:rPr>
+                <w:rFonts w:ascii="Times New Roman" w:hAnsi="Times New Roman"/>
+                <w:b w:val="0"/>
+                <w:sz w:val="15"/>
+              </w:rPr>
+              <w:t>43.18%</w:t>
+            </w:r>
+          </w:p>
+        </w:tc>
+        <w:tc>
+          <w:tcPr>
+            <w:tcW w:type="dxa" w:w="1149"/>
+          </w:tcPr>
+          <w:p>
+            <w:pPr>
+              <w:spacing w:after="0"/>
+            </w:pPr>
+            <w:r>
+              <w:rPr>
+                <w:rFonts w:ascii="Times New Roman" w:hAnsi="Times New Roman"/>
+                <w:b w:val="0"/>
+                <w:sz w:val="15"/>
+              </w:rPr>
+              <w:t>0.5845</w:t>
+            </w:r>
+          </w:p>
+        </w:tc>
+        <w:tc>
+          <w:tcPr>
+            <w:tcW w:type="dxa" w:w="1149"/>
+          </w:tcPr>
+          <w:p>
+            <w:pPr>
+              <w:spacing w:after="0"/>
+            </w:pPr>
+            <w:r>
+              <w:rPr>
+                <w:rFonts w:ascii="Times New Roman" w:hAnsi="Times New Roman"/>
+                <w:b w:val="0"/>
+                <w:sz w:val="15"/>
+              </w:rPr>
+              <w:t>0.9621</w:t>
             </w:r>
           </w:p>
         </w:tc>
       </w:tr>
     </w:tbl>
+    <w:p>
+      <w:pPr>
+        <w:spacing w:after="40" w:line="240" w:lineRule="auto"/>
+        <w:ind w:firstLine="230"/>
+        <w:jc w:val="both"/>
+      </w:pPr>
+      <w:r>
+        <w:t>Frozen XLS-R achieved 92.12% accuracy and ROC-AUC 0.9828 on the same 584-instance held-out V1 test set. Its EER of 6.88% was comparable to the acoustic baseline's 6.56%, indicating stronger ranking performance without a uniform improvement across all decision metrics. An earlier acoustic checkpoint produced 93.66% accuracy, but the frozen Round 3 canonical checkpoint produces 91.61%; EER remained 6.56% because ranking behavior remained similar. That 93.66% figure is historical only.</w:t>
+      </w:r>
+    </w:p>
+    <w:p>
+      <w:pPr>
+        <w:jc w:val="center"/>
+      </w:pPr>
+      <w:r>
+        <w:drawing>
+          <wp:inline xmlns:a="http://schemas.openxmlformats.org/drawingml/2006/main" xmlns:pic="http://schemas.openxmlformats.org/drawingml/2006/picture">
+            <wp:extent cx="2907792" cy="2460439"/>
+            <wp:docPr id="2" name="Picture 2"/>
+            <wp:cNvGraphicFramePr>
+              <a:graphicFrameLocks noChangeAspect="1"/>
+            </wp:cNvGraphicFramePr>
+            <a:graphic>
+              <a:graphicData uri="http://schemas.openxmlformats.org/drawingml/2006/picture">
+                <pic:pic>
+                  <pic:nvPicPr>
+                    <pic:cNvPr id="0" name="confusion_matrix.png"/>
+                    <pic:cNvPicPr/>
+                  </pic:nvPicPr>
+                  <pic:blipFill>
+                    <a:blip r:embed="rId10"/>
+                    <a:stretch>
+                      <a:fillRect/>
+                    </a:stretch>
+                  </pic:blipFill>
+                  <pic:spPr>
+                    <a:xfrm>
+                      <a:off x="0" y="0"/>
+                      <a:ext cx="2907792" cy="2460439"/>
+                    </a:xfrm>
+                    <a:prstGeom prst="rect"/>
+                  </pic:spPr>
+                </pic:pic>
+              </a:graphicData>
+            </a:graphic>
+          </wp:inline>
+        </w:drawing>
+      </w:r>
+    </w:p>
+    <w:p>
+      <w:pPr>
+        <w:spacing w:after="60"/>
+        <w:jc w:val="center"/>
+      </w:pPr>
+      <w:r>
+        <w:rPr>
+          <w:sz w:val="16"/>
+        </w:rPr>
+        <w:t>Fig. 2. Confusion matrix for Acoustic Baseline V1 on the held-out V1 test partition (n=584).</w:t>
+      </w:r>
+    </w:p>
+    <w:p>
+      <w:pPr>
+        <w:spacing w:before="100" w:after="40"/>
+        <w:jc w:val="center"/>
+      </w:pPr>
+      <w:r>
+        <w:rPr>
+          <w:rFonts w:ascii="Times New Roman" w:hAnsi="Times New Roman"/>
+          <w:b/>
+          <w:sz w:val="20"/>
+        </w:rPr>
+        <w:t>VI. COMPRESSION (RQ1)</w:t>
+      </w:r>
+    </w:p>
     <w:p>
       <w:pPr>
         <w:jc w:val="center"/>
@@ -1272,7 +2136,7 @@
           <w:b/>
           <w:sz w:val="16"/>
         </w:rPr>
-        <w:t>TABLE IV. CLEAN AND PAIRED-OPUS RESULTS</w:t>
+        <w:t>TABLE IV. RQ1 ACOUSTIC BASELINE V1, CLEAN VERSUS OPUS</w:t>
       </w:r>
     </w:p>
     <w:tbl>
@@ -1357,7 +2221,7 @@
                 <w:b/>
                 <w:sz w:val="15"/>
               </w:rPr>
-              <w:t>F1</w:t>
+              <w:t>EER</w:t>
             </w:r>
           </w:p>
         </w:tc>
@@ -1375,7 +2239,7 @@
                 <w:b/>
                 <w:sz w:val="15"/>
               </w:rPr>
-              <w:t>EER</w:t>
+              <w:t>F1</w:t>
             </w:r>
           </w:p>
         </w:tc>
@@ -1431,7 +2295,7 @@
                 <w:b w:val="0"/>
                 <w:sz w:val="15"/>
               </w:rPr>
-              <w:t>93.8%</w:t>
+              <w:t>93.84%</w:t>
             </w:r>
           </w:p>
         </w:tc>
@@ -1449,7 +2313,7 @@
                 <w:b w:val="0"/>
                 <w:sz w:val="15"/>
               </w:rPr>
-              <w:t>93.5%</w:t>
+              <w:t>5.63%</w:t>
             </w:r>
           </w:p>
         </w:tc>
@@ -1467,7 +2331,7 @@
                 <w:b w:val="0"/>
                 <w:sz w:val="15"/>
               </w:rPr>
-              <w:t>5.6%</w:t>
+              <w:t>93.53%</w:t>
             </w:r>
           </w:p>
         </w:tc>
@@ -1487,7 +2351,7 @@
                 <w:b w:val="0"/>
                 <w:sz w:val="15"/>
               </w:rPr>
-              <w:t>Opus 16 kbps</w:t>
+              <w:t>Opus 16 kbps WhatsApp-style simulation</w:t>
             </w:r>
           </w:p>
         </w:tc>
@@ -1523,7 +2387,7 @@
                 <w:b w:val="0"/>
                 <w:sz w:val="15"/>
               </w:rPr>
-              <w:t>89.4%</w:t>
+              <w:t>89.38%</w:t>
             </w:r>
           </w:p>
         </w:tc>
@@ -1541,7 +2405,7 @@
                 <w:b w:val="0"/>
                 <w:sz w:val="15"/>
               </w:rPr>
-              <w:t>89.3%</w:t>
+              <w:t>7.58%</w:t>
             </w:r>
           </w:p>
         </w:tc>
@@ -1559,7 +2423,7 @@
                 <w:b w:val="0"/>
                 <w:sz w:val="15"/>
               </w:rPr>
-              <w:t>7.6%</w:t>
+              <w:t>89.27%</w:t>
             </w:r>
           </w:p>
         </w:tc>
@@ -1574,7 +2438,7 @@
           <w:b/>
           <w:sz w:val="16"/>
         </w:rPr>
-        <w:t>TABLE V. LEAVE-ONE-LANGUAGE-OUT TRANSFER</w:t>
+        <w:t>TABLE V. RQ1 FROZEN XLS-R, CLEAN VERSUS OPUS</w:t>
       </w:r>
     </w:p>
     <w:tbl>
@@ -1605,7 +2469,7 @@
                 <w:b/>
                 <w:sz w:val="15"/>
               </w:rPr>
-              <w:t>Unseen language</w:t>
+              <w:t>Condition</w:t>
             </w:r>
           </w:p>
         </w:tc>
@@ -1659,7 +2523,366 @@
                 <w:b/>
                 <w:sz w:val="15"/>
               </w:rPr>
+              <w:t>EER</w:t>
+            </w:r>
+          </w:p>
+        </w:tc>
+        <w:tc>
+          <w:tcPr>
+            <w:tcW w:type="dxa" w:w="2068"/>
+          </w:tcPr>
+          <w:p>
+            <w:pPr>
+              <w:spacing w:after="0"/>
+            </w:pPr>
+            <w:r>
+              <w:rPr>
+                <w:rFonts w:ascii="Times New Roman" w:hAnsi="Times New Roman"/>
+                <w:b/>
+                <w:sz w:val="15"/>
+              </w:rPr>
               <w:t>F1</w:t>
+            </w:r>
+          </w:p>
+        </w:tc>
+      </w:tr>
+      <w:tr>
+        <w:tc>
+          <w:tcPr>
+            <w:tcW w:type="dxa" w:w="2068"/>
+          </w:tcPr>
+          <w:p>
+            <w:pPr>
+              <w:spacing w:after="0"/>
+            </w:pPr>
+            <w:r>
+              <w:rPr>
+                <w:rFonts w:ascii="Times New Roman" w:hAnsi="Times New Roman"/>
+                <w:b w:val="0"/>
+                <w:sz w:val="15"/>
+              </w:rPr>
+              <w:t>Clean</w:t>
+            </w:r>
+          </w:p>
+        </w:tc>
+        <w:tc>
+          <w:tcPr>
+            <w:tcW w:type="dxa" w:w="2068"/>
+          </w:tcPr>
+          <w:p>
+            <w:pPr>
+              <w:spacing w:after="0"/>
+            </w:pPr>
+            <w:r>
+              <w:rPr>
+                <w:rFonts w:ascii="Times New Roman" w:hAnsi="Times New Roman"/>
+                <w:b w:val="0"/>
+                <w:sz w:val="15"/>
+              </w:rPr>
+              <w:t>292</w:t>
+            </w:r>
+          </w:p>
+        </w:tc>
+        <w:tc>
+          <w:tcPr>
+            <w:tcW w:type="dxa" w:w="2068"/>
+          </w:tcPr>
+          <w:p>
+            <w:pPr>
+              <w:spacing w:after="0"/>
+            </w:pPr>
+            <w:r>
+              <w:rPr>
+                <w:rFonts w:ascii="Times New Roman" w:hAnsi="Times New Roman"/>
+                <w:b w:val="0"/>
+                <w:sz w:val="15"/>
+              </w:rPr>
+              <w:t>91.44%</w:t>
+            </w:r>
+          </w:p>
+        </w:tc>
+        <w:tc>
+          <w:tcPr>
+            <w:tcW w:type="dxa" w:w="2068"/>
+          </w:tcPr>
+          <w:p>
+            <w:pPr>
+              <w:spacing w:after="0"/>
+            </w:pPr>
+            <w:r>
+              <w:rPr>
+                <w:rFonts w:ascii="Times New Roman" w:hAnsi="Times New Roman"/>
+                <w:b w:val="0"/>
+                <w:sz w:val="15"/>
+              </w:rPr>
+              <w:t>8.13%</w:t>
+            </w:r>
+          </w:p>
+        </w:tc>
+        <w:tc>
+          <w:tcPr>
+            <w:tcW w:type="dxa" w:w="2068"/>
+          </w:tcPr>
+          <w:p>
+            <w:pPr>
+              <w:spacing w:after="0"/>
+            </w:pPr>
+            <w:r>
+              <w:rPr>
+                <w:rFonts w:ascii="Times New Roman" w:hAnsi="Times New Roman"/>
+                <w:b w:val="0"/>
+                <w:sz w:val="15"/>
+              </w:rPr>
+              <w:t>91.04%</w:t>
+            </w:r>
+          </w:p>
+        </w:tc>
+      </w:tr>
+      <w:tr>
+        <w:tc>
+          <w:tcPr>
+            <w:tcW w:type="dxa" w:w="2068"/>
+          </w:tcPr>
+          <w:p>
+            <w:pPr>
+              <w:spacing w:after="0"/>
+            </w:pPr>
+            <w:r>
+              <w:rPr>
+                <w:rFonts w:ascii="Times New Roman" w:hAnsi="Times New Roman"/>
+                <w:b w:val="0"/>
+                <w:sz w:val="15"/>
+              </w:rPr>
+              <w:t>Opus 16 kbps WhatsApp-style simulation</w:t>
+            </w:r>
+          </w:p>
+        </w:tc>
+        <w:tc>
+          <w:tcPr>
+            <w:tcW w:type="dxa" w:w="2068"/>
+          </w:tcPr>
+          <w:p>
+            <w:pPr>
+              <w:spacing w:after="0"/>
+            </w:pPr>
+            <w:r>
+              <w:rPr>
+                <w:rFonts w:ascii="Times New Roman" w:hAnsi="Times New Roman"/>
+                <w:b w:val="0"/>
+                <w:sz w:val="15"/>
+              </w:rPr>
+              <w:t>292</w:t>
+            </w:r>
+          </w:p>
+        </w:tc>
+        <w:tc>
+          <w:tcPr>
+            <w:tcW w:type="dxa" w:w="2068"/>
+          </w:tcPr>
+          <w:p>
+            <w:pPr>
+              <w:spacing w:after="0"/>
+            </w:pPr>
+            <w:r>
+              <w:rPr>
+                <w:rFonts w:ascii="Times New Roman" w:hAnsi="Times New Roman"/>
+                <w:b w:val="0"/>
+                <w:sz w:val="15"/>
+              </w:rPr>
+              <w:t>92.81%</w:t>
+            </w:r>
+          </w:p>
+        </w:tc>
+        <w:tc>
+          <w:tcPr>
+            <w:tcW w:type="dxa" w:w="2068"/>
+          </w:tcPr>
+          <w:p>
+            <w:pPr>
+              <w:spacing w:after="0"/>
+            </w:pPr>
+            <w:r>
+              <w:rPr>
+                <w:rFonts w:ascii="Times New Roman" w:hAnsi="Times New Roman"/>
+                <w:b w:val="0"/>
+                <w:sz w:val="15"/>
+              </w:rPr>
+              <w:t>6.06%</w:t>
+            </w:r>
+          </w:p>
+        </w:tc>
+        <w:tc>
+          <w:tcPr>
+            <w:tcW w:type="dxa" w:w="2068"/>
+          </w:tcPr>
+          <w:p>
+            <w:pPr>
+              <w:spacing w:after="0"/>
+            </w:pPr>
+            <w:r>
+              <w:rPr>
+                <w:rFonts w:ascii="Times New Roman" w:hAnsi="Times New Roman"/>
+                <w:b w:val="0"/>
+                <w:sz w:val="15"/>
+              </w:rPr>
+              <w:t>92.19%</w:t>
+            </w:r>
+          </w:p>
+        </w:tc>
+      </w:tr>
+    </w:tbl>
+    <w:p>
+      <w:pPr>
+        <w:spacing w:after="40" w:line="240" w:lineRule="auto"/>
+        <w:ind w:firstLine="230"/>
+        <w:jc w:val="both"/>
+      </w:pPr>
+      <w:r>
+        <w:t>Compression effects were model-dependent. Acoustic Baseline V1 degraded from 93.84% clean accuracy to 89.38% under WhatsApp-style Opus simulation (approximately 4.46 percentage points). Frozen XLS-R did not show the same degradation on this bounded split (91.44% clean, 92.81% Opus). These numbers must not be mixed across models.</w:t>
+      </w:r>
+    </w:p>
+    <w:p>
+      <w:pPr>
+        <w:jc w:val="center"/>
+      </w:pPr>
+      <w:r>
+        <w:drawing>
+          <wp:inline xmlns:a="http://schemas.openxmlformats.org/drawingml/2006/main" xmlns:pic="http://schemas.openxmlformats.org/drawingml/2006/picture">
+            <wp:extent cx="2907792" cy="1778885"/>
+            <wp:docPr id="3" name="Picture 3"/>
+            <wp:cNvGraphicFramePr>
+              <a:graphicFrameLocks noChangeAspect="1"/>
+            </wp:cNvGraphicFramePr>
+            <a:graphic>
+              <a:graphicData uri="http://schemas.openxmlformats.org/drawingml/2006/picture">
+                <pic:pic>
+                  <pic:nvPicPr>
+                    <pic:cNvPr id="0" name="condition_breakdown.png"/>
+                    <pic:cNvPicPr/>
+                  </pic:nvPicPr>
+                  <pic:blipFill>
+                    <a:blip r:embed="rId11"/>
+                    <a:stretch>
+                      <a:fillRect/>
+                    </a:stretch>
+                  </pic:blipFill>
+                  <pic:spPr>
+                    <a:xfrm>
+                      <a:off x="0" y="0"/>
+                      <a:ext cx="2907792" cy="1778885"/>
+                    </a:xfrm>
+                    <a:prstGeom prst="rect"/>
+                  </pic:spPr>
+                </pic:pic>
+              </a:graphicData>
+            </a:graphic>
+          </wp:inline>
+        </w:drawing>
+      </w:r>
+    </w:p>
+    <w:p>
+      <w:pPr>
+        <w:spacing w:after="60"/>
+        <w:jc w:val="center"/>
+      </w:pPr>
+      <w:r>
+        <w:rPr>
+          <w:sz w:val="16"/>
+        </w:rPr>
+        <w:t>Fig. 3. Acoustic Baseline V1 clean versus WhatsApp-style Opus simulation on paired test instances.</w:t>
+      </w:r>
+    </w:p>
+    <w:p>
+      <w:pPr>
+        <w:spacing w:before="100" w:after="40"/>
+        <w:jc w:val="center"/>
+      </w:pPr>
+      <w:r>
+        <w:rPr>
+          <w:rFonts w:ascii="Times New Roman" w:hAnsi="Times New Roman"/>
+          <w:b/>
+          <w:sz w:val="20"/>
+        </w:rPr>
+        <w:t>VII. ENGLISH-ONLY TRANSFER (RQ2)</w:t>
+      </w:r>
+    </w:p>
+    <w:p>
+      <w:pPr>
+        <w:jc w:val="center"/>
+      </w:pPr>
+      <w:r>
+        <w:rPr>
+          <w:b/>
+          <w:sz w:val="16"/>
+        </w:rPr>
+        <w:t>TABLE VI. RQ2 ENGLISH-ONLY VERSUS MULTILINGUAL ON THE SAME INDIC TEST</w:t>
+      </w:r>
+    </w:p>
+    <w:tbl>
+      <w:tblPr>
+        <w:tblStyle w:val="TableGrid"/>
+        <w:tblW w:type="auto" w:w="0"/>
+        <w:tblLook w:firstColumn="1" w:firstRow="1" w:lastColumn="0" w:lastRow="0" w:noHBand="0" w:noVBand="1" w:val="04A0"/>
+      </w:tblPr>
+      <w:tblGrid>
+        <w:gridCol w:w="2068"/>
+        <w:gridCol w:w="2068"/>
+        <w:gridCol w:w="2068"/>
+        <w:gridCol w:w="2068"/>
+        <w:gridCol w:w="2068"/>
+      </w:tblGrid>
+      <w:tr>
+        <w:tc>
+          <w:tcPr>
+            <w:tcW w:type="dxa" w:w="2068"/>
+          </w:tcPr>
+          <w:p>
+            <w:pPr>
+              <w:spacing w:after="0"/>
+            </w:pPr>
+            <w:r>
+              <w:rPr>
+                <w:rFonts w:ascii="Times New Roman" w:hAnsi="Times New Roman"/>
+                <w:b/>
+                <w:sz w:val="15"/>
+              </w:rPr>
+              <w:t>Model</w:t>
+            </w:r>
+          </w:p>
+        </w:tc>
+        <w:tc>
+          <w:tcPr>
+            <w:tcW w:type="dxa" w:w="2068"/>
+          </w:tcPr>
+          <w:p>
+            <w:pPr>
+              <w:spacing w:after="0"/>
+            </w:pPr>
+            <w:r>
+              <w:rPr>
+                <w:rFonts w:ascii="Times New Roman" w:hAnsi="Times New Roman"/>
+                <w:b/>
+                <w:sz w:val="15"/>
+              </w:rPr>
+              <w:t>n</w:t>
+            </w:r>
+          </w:p>
+        </w:tc>
+        <w:tc>
+          <w:tcPr>
+            <w:tcW w:type="dxa" w:w="2068"/>
+          </w:tcPr>
+          <w:p>
+            <w:pPr>
+              <w:spacing w:after="0"/>
+            </w:pPr>
+            <w:r>
+              <w:rPr>
+                <w:rFonts w:ascii="Times New Roman" w:hAnsi="Times New Roman"/>
+                <w:b/>
+                <w:sz w:val="15"/>
+              </w:rPr>
+              <w:t>Accuracy</w:t>
             </w:r>
           </w:p>
         </w:tc>
@@ -1681,8 +2904,6 @@
             </w:r>
           </w:p>
         </w:tc>
-      </w:tr>
-      <w:tr>
         <w:tc>
           <w:tcPr>
             <w:tcW w:type="dxa" w:w="2068"/>
@@ -1694,82 +2915,10 @@
             <w:r>
               <w:rPr>
                 <w:rFonts w:ascii="Times New Roman" w:hAnsi="Times New Roman"/>
-                <w:b w:val="0"/>
+                <w:b/>
                 <w:sz w:val="15"/>
               </w:rPr>
-              <w:t>Hindi</w:t>
-            </w:r>
-          </w:p>
-        </w:tc>
-        <w:tc>
-          <w:tcPr>
-            <w:tcW w:type="dxa" w:w="2068"/>
-          </w:tcPr>
-          <w:p>
-            <w:pPr>
-              <w:spacing w:after="0"/>
-            </w:pPr>
-            <w:r>
-              <w:rPr>
-                <w:rFonts w:ascii="Times New Roman" w:hAnsi="Times New Roman"/>
-                <w:b w:val="0"/>
-                <w:sz w:val="15"/>
-              </w:rPr>
-              <w:t>222</w:t>
-            </w:r>
-          </w:p>
-        </w:tc>
-        <w:tc>
-          <w:tcPr>
-            <w:tcW w:type="dxa" w:w="2068"/>
-          </w:tcPr>
-          <w:p>
-            <w:pPr>
-              <w:spacing w:after="0"/>
-            </w:pPr>
-            <w:r>
-              <w:rPr>
-                <w:rFonts w:ascii="Times New Roman" w:hAnsi="Times New Roman"/>
-                <w:b w:val="0"/>
-                <w:sz w:val="15"/>
-              </w:rPr>
-              <w:t>78.8%</w:t>
-            </w:r>
-          </w:p>
-        </w:tc>
-        <w:tc>
-          <w:tcPr>
-            <w:tcW w:type="dxa" w:w="2068"/>
-          </w:tcPr>
-          <w:p>
-            <w:pPr>
-              <w:spacing w:after="0"/>
-            </w:pPr>
-            <w:r>
-              <w:rPr>
-                <w:rFonts w:ascii="Times New Roman" w:hAnsi="Times New Roman"/>
-                <w:b w:val="0"/>
-                <w:sz w:val="15"/>
-              </w:rPr>
-              <w:t>72.5%</w:t>
-            </w:r>
-          </w:p>
-        </w:tc>
-        <w:tc>
-          <w:tcPr>
-            <w:tcW w:type="dxa" w:w="2068"/>
-          </w:tcPr>
-          <w:p>
-            <w:pPr>
-              <w:spacing w:after="0"/>
-            </w:pPr>
-            <w:r>
-              <w:rPr>
-                <w:rFonts w:ascii="Times New Roman" w:hAnsi="Times New Roman"/>
-                <w:b w:val="0"/>
-                <w:sz w:val="15"/>
-              </w:rPr>
-              <w:t>21.8%</w:t>
+              <w:t>ROC-AUC</w:t>
             </w:r>
           </w:p>
         </w:tc>
@@ -1789,7 +2938,7 @@
                 <w:b w:val="0"/>
                 <w:sz w:val="15"/>
               </w:rPr>
-              <w:t>Marathi</w:t>
+              <w:t>English-only ASVspoof LA ? Indic test</w:t>
             </w:r>
           </w:p>
         </w:tc>
@@ -1807,7 +2956,7 @@
                 <w:b w:val="0"/>
                 <w:sz w:val="15"/>
               </w:rPr>
-              <w:t>164</w:t>
+              <w:t>584</w:t>
             </w:r>
           </w:p>
         </w:tc>
@@ -1825,7 +2974,7 @@
                 <w:b w:val="0"/>
                 <w:sz w:val="15"/>
               </w:rPr>
-              <w:t>93.3%</w:t>
+              <w:t>54.8%</w:t>
             </w:r>
           </w:p>
         </w:tc>
@@ -1843,7 +2992,7 @@
                 <w:b w:val="0"/>
                 <w:sz w:val="15"/>
               </w:rPr>
-              <w:t>95.2%</w:t>
+              <w:t>76.56%</w:t>
             </w:r>
           </w:p>
         </w:tc>
@@ -1861,7 +3010,7 @@
                 <w:b w:val="0"/>
                 <w:sz w:val="15"/>
               </w:rPr>
-              <w:t>7.1%</w:t>
+              <w:t>0.162</w:t>
             </w:r>
           </w:p>
         </w:tc>
@@ -1881,7 +3030,7 @@
                 <w:b w:val="0"/>
                 <w:sz w:val="15"/>
               </w:rPr>
-              <w:t>Tamil</w:t>
+              <w:t>Multilingual Acoustic Baseline V1</w:t>
             </w:r>
           </w:p>
         </w:tc>
@@ -1899,7 +3048,7 @@
                 <w:b w:val="0"/>
                 <w:sz w:val="15"/>
               </w:rPr>
-              <w:t>198</w:t>
+              <w:t>584</w:t>
             </w:r>
           </w:p>
         </w:tc>
@@ -1917,7 +3066,7 @@
                 <w:b w:val="0"/>
                 <w:sz w:val="15"/>
               </w:rPr>
-              <w:t>93.9%</w:t>
+              <w:t>91.61%</w:t>
             </w:r>
           </w:p>
         </w:tc>
@@ -1935,7 +3084,7 @@
                 <w:b w:val="0"/>
                 <w:sz w:val="15"/>
               </w:rPr>
-              <w:t>92.2%</w:t>
+              <w:t>6.56%</w:t>
             </w:r>
           </w:p>
         </w:tc>
@@ -1953,7 +3102,7 @@
                 <w:b w:val="0"/>
                 <w:sz w:val="15"/>
               </w:rPr>
-              <w:t>6.3%</w:t>
+              <w:t>0.9729</w:t>
             </w:r>
           </w:p>
         </w:tc>
@@ -1961,104 +3110,12 @@
     </w:tbl>
     <w:p>
       <w:pPr>
-        <w:jc w:val="center"/>
+        <w:spacing w:after="40" w:line="240" w:lineRule="auto"/>
+        <w:ind w:firstLine="230"/>
+        <w:jc w:val="both"/>
       </w:pPr>
       <w:r>
-        <w:drawing>
-          <wp:inline xmlns:a="http://schemas.openxmlformats.org/drawingml/2006/main" xmlns:pic="http://schemas.openxmlformats.org/drawingml/2006/picture">
-            <wp:extent cx="2907792" cy="1680058"/>
-            <wp:docPr id="2" name="Picture 2"/>
-            <wp:cNvGraphicFramePr>
-              <a:graphicFrameLocks noChangeAspect="1"/>
-            </wp:cNvGraphicFramePr>
-            <a:graphic>
-              <a:graphicData uri="http://schemas.openxmlformats.org/drawingml/2006/picture">
-                <pic:pic>
-                  <pic:nvPicPr>
-                    <pic:cNvPr id="0" name="cross_lingual_transfer.png"/>
-                    <pic:cNvPicPr/>
-                  </pic:nvPicPr>
-                  <pic:blipFill>
-                    <a:blip r:embed="rId10"/>
-                    <a:stretch>
-                      <a:fillRect/>
-                    </a:stretch>
-                  </pic:blipFill>
-                  <pic:spPr>
-                    <a:xfrm>
-                      <a:off x="0" y="0"/>
-                      <a:ext cx="2907792" cy="1680058"/>
-                    </a:xfrm>
-                    <a:prstGeom prst="rect"/>
-                  </pic:spPr>
-                </pic:pic>
-              </a:graphicData>
-            </a:graphic>
-          </wp:inline>
-        </w:drawing>
-      </w:r>
-    </w:p>
-    <w:p>
-      <w:pPr>
-        <w:spacing w:after="60"/>
-        <w:jc w:val="center"/>
-      </w:pPr>
-      <w:r>
-        <w:rPr>
-          <w:sz w:val="16"/>
-        </w:rPr>
-        <w:t>Fig. 2. Transfer when each test language is excluded from training.</w:t>
-      </w:r>
-    </w:p>
-    <w:p>
-      <w:pPr>
-        <w:jc w:val="center"/>
-      </w:pPr>
-      <w:r>
-        <w:drawing>
-          <wp:inline xmlns:a="http://schemas.openxmlformats.org/drawingml/2006/main" xmlns:pic="http://schemas.openxmlformats.org/drawingml/2006/picture">
-            <wp:extent cx="2907792" cy="2460439"/>
-            <wp:docPr id="3" name="Picture 3"/>
-            <wp:cNvGraphicFramePr>
-              <a:graphicFrameLocks noChangeAspect="1"/>
-            </wp:cNvGraphicFramePr>
-            <a:graphic>
-              <a:graphicData uri="http://schemas.openxmlformats.org/drawingml/2006/picture">
-                <pic:pic>
-                  <pic:nvPicPr>
-                    <pic:cNvPr id="0" name="confusion_matrix.png"/>
-                    <pic:cNvPicPr/>
-                  </pic:nvPicPr>
-                  <pic:blipFill>
-                    <a:blip r:embed="rId11"/>
-                    <a:stretch>
-                      <a:fillRect/>
-                    </a:stretch>
-                  </pic:blipFill>
-                  <pic:spPr>
-                    <a:xfrm>
-                      <a:off x="0" y="0"/>
-                      <a:ext cx="2907792" cy="2460439"/>
-                    </a:xfrm>
-                    <a:prstGeom prst="rect"/>
-                  </pic:spPr>
-                </pic:pic>
-              </a:graphicData>
-            </a:graphic>
-          </wp:inline>
-        </w:drawing>
-      </w:r>
-    </w:p>
-    <w:p>
-      <w:pPr>
-        <w:spacing w:after="60"/>
-        <w:jc w:val="center"/>
-      </w:pPr>
-      <w:r>
-        <w:rPr>
-          <w:sz w:val="16"/>
-        </w:rPr>
-        <w:t>Fig. 3. Confusion matrix on the held-out test partition.</w:t>
+        <w:t>The English-only model failed to transfer effectively to the Indic benchmark: 54.8% accuracy, 76.56% EER, and 0.162 ROC-AUC, predicting every instance as REAL at threshold 0.5. A diagnostic that multiplies scores by ?1 yields ROC-AUC 0.838 and EER 23.44%, but official scores were not flipped. The global VaaniQ score contract is validated by multilingual Baseline V1 (91.61% accuracy, 6.56% EER, 0.9729 ROC-AUC) on the same test. The result is catastrophic English?Indic transfer with anti-correlated ranking, not a generic score-inversion bug.</w:t>
       </w:r>
     </w:p>
     <w:p>
@@ -2072,17 +3129,7 @@
           <w:b/>
           <w:sz w:val="20"/>
         </w:rPr>
-        <w:t>VI. CALIBRATION AND RELIABILITY</w:t>
-      </w:r>
-    </w:p>
-    <w:p>
-      <w:pPr>
-        <w:spacing w:after="40" w:line="240" w:lineRule="auto"/>
-        <w:ind w:firstLine="230"/>
-        <w:jc w:val="both"/>
-      </w:pPr>
-      <w:r>
-        <w:t>Calibration strategy was selected on validation ECE only (global vs per-languagecondition temperature scaling). Per-cell scaling overfit small validation cells; global validation-fitted temperature improved held-out ECE (0.038 ? 0.028) in the audit replay. The persisted train report uses the validation-selected strategy: per_language_and_condition.</w:t>
+        <w:t>VIII. CROSS-LINGUAL TRANSFER (RQ3)</w:t>
       </w:r>
     </w:p>
     <w:p>
@@ -2094,819 +3141,7 @@
           <w:b/>
           <w:sz w:val="16"/>
         </w:rPr>
-        <w:t>TABLE VI. HELD-OUT CALIBRATION (VALIDATION-SELECTED GLOBAL TEMPERATURE)</w:t>
-      </w:r>
-    </w:p>
-    <w:tbl>
-      <w:tblPr>
-        <w:tblStyle w:val="TableGrid"/>
-        <w:tblW w:type="auto" w:w="0"/>
-        <w:tblLook w:firstColumn="1" w:firstRow="1" w:lastColumn="0" w:lastRow="0" w:noHBand="0" w:noVBand="1" w:val="04A0"/>
-      </w:tblPr>
-      <w:tblGrid>
-        <w:gridCol w:w="3447"/>
-        <w:gridCol w:w="3447"/>
-        <w:gridCol w:w="3447"/>
-      </w:tblGrid>
-      <w:tr>
-        <w:tc>
-          <w:tcPr>
-            <w:tcW w:type="dxa" w:w="3447"/>
-          </w:tcPr>
-          <w:p>
-            <w:pPr>
-              <w:spacing w:after="0"/>
-            </w:pPr>
-            <w:r>
-              <w:rPr>
-                <w:rFonts w:ascii="Times New Roman" w:hAnsi="Times New Roman"/>
-                <w:b/>
-                <w:sz w:val="15"/>
-              </w:rPr>
-              <w:t>Error</w:t>
-            </w:r>
-          </w:p>
-        </w:tc>
-        <w:tc>
-          <w:tcPr>
-            <w:tcW w:type="dxa" w:w="3447"/>
-          </w:tcPr>
-          <w:p>
-            <w:pPr>
-              <w:spacing w:after="0"/>
-            </w:pPr>
-            <w:r>
-              <w:rPr>
-                <w:rFonts w:ascii="Times New Roman" w:hAnsi="Times New Roman"/>
-                <w:b/>
-                <w:sz w:val="15"/>
-              </w:rPr>
-              <w:t>Uncalibrated</w:t>
-            </w:r>
-          </w:p>
-        </w:tc>
-        <w:tc>
-          <w:tcPr>
-            <w:tcW w:type="dxa" w:w="3447"/>
-          </w:tcPr>
-          <w:p>
-            <w:pPr>
-              <w:spacing w:after="0"/>
-            </w:pPr>
-            <w:r>
-              <w:rPr>
-                <w:rFonts w:ascii="Times New Roman" w:hAnsi="Times New Roman"/>
-                <w:b/>
-                <w:sz w:val="15"/>
-              </w:rPr>
-              <w:t>Global TS (selected on val)</w:t>
-            </w:r>
-          </w:p>
-        </w:tc>
-      </w:tr>
-      <w:tr>
-        <w:tc>
-          <w:tcPr>
-            <w:tcW w:type="dxa" w:w="3447"/>
-          </w:tcPr>
-          <w:p>
-            <w:pPr>
-              <w:spacing w:after="0"/>
-            </w:pPr>
-            <w:r>
-              <w:rPr>
-                <w:rFonts w:ascii="Times New Roman" w:hAnsi="Times New Roman"/>
-                <w:b w:val="0"/>
-                <w:sz w:val="15"/>
-              </w:rPr>
-              <w:t>ECE</w:t>
-            </w:r>
-          </w:p>
-        </w:tc>
-        <w:tc>
-          <w:tcPr>
-            <w:tcW w:type="dxa" w:w="3447"/>
-          </w:tcPr>
-          <w:p>
-            <w:pPr>
-              <w:spacing w:after="0"/>
-            </w:pPr>
-            <w:r>
-              <w:rPr>
-                <w:rFonts w:ascii="Times New Roman" w:hAnsi="Times New Roman"/>
-                <w:b w:val="0"/>
-                <w:sz w:val="15"/>
-              </w:rPr>
-              <w:t>0.038</w:t>
-            </w:r>
-          </w:p>
-        </w:tc>
-        <w:tc>
-          <w:tcPr>
-            <w:tcW w:type="dxa" w:w="3447"/>
-          </w:tcPr>
-          <w:p>
-            <w:pPr>
-              <w:spacing w:after="0"/>
-            </w:pPr>
-            <w:r>
-              <w:rPr>
-                <w:rFonts w:ascii="Times New Roman" w:hAnsi="Times New Roman"/>
-                <w:b w:val="0"/>
-                <w:sz w:val="15"/>
-              </w:rPr>
-              <w:t>0.028</w:t>
-            </w:r>
-          </w:p>
-        </w:tc>
-      </w:tr>
-      <w:tr>
-        <w:tc>
-          <w:tcPr>
-            <w:tcW w:type="dxa" w:w="3447"/>
-          </w:tcPr>
-          <w:p>
-            <w:pPr>
-              <w:spacing w:after="0"/>
-            </w:pPr>
-            <w:r>
-              <w:rPr>
-                <w:rFonts w:ascii="Times New Roman" w:hAnsi="Times New Roman"/>
-                <w:b w:val="0"/>
-                <w:sz w:val="15"/>
-              </w:rPr>
-              <w:t>Brier</w:t>
-            </w:r>
-          </w:p>
-        </w:tc>
-        <w:tc>
-          <w:tcPr>
-            <w:tcW w:type="dxa" w:w="3447"/>
-          </w:tcPr>
-          <w:p>
-            <w:pPr>
-              <w:spacing w:after="0"/>
-            </w:pPr>
-            <w:r>
-              <w:rPr>
-                <w:rFonts w:ascii="Times New Roman" w:hAnsi="Times New Roman"/>
-                <w:b w:val="0"/>
-                <w:sz w:val="15"/>
-              </w:rPr>
-              <w:t>0.055</w:t>
-            </w:r>
-          </w:p>
-        </w:tc>
-        <w:tc>
-          <w:tcPr>
-            <w:tcW w:type="dxa" w:w="3447"/>
-          </w:tcPr>
-          <w:p>
-            <w:pPr>
-              <w:spacing w:after="0"/>
-            </w:pPr>
-            <w:r>
-              <w:rPr>
-                <w:rFonts w:ascii="Times New Roman" w:hAnsi="Times New Roman"/>
-                <w:b w:val="0"/>
-                <w:sz w:val="15"/>
-              </w:rPr>
-              <w:t>0.054</w:t>
-            </w:r>
-          </w:p>
-        </w:tc>
-      </w:tr>
-    </w:tbl>
-    <w:p>
-      <w:pPr>
-        <w:jc w:val="center"/>
-      </w:pPr>
-      <w:r>
-        <w:drawing>
-          <wp:inline xmlns:a="http://schemas.openxmlformats.org/drawingml/2006/main" xmlns:pic="http://schemas.openxmlformats.org/drawingml/2006/picture">
-            <wp:extent cx="2907792" cy="1881512"/>
-            <wp:docPr id="4" name="Picture 4"/>
-            <wp:cNvGraphicFramePr>
-              <a:graphicFrameLocks noChangeAspect="1"/>
-            </wp:cNvGraphicFramePr>
-            <a:graphic>
-              <a:graphicData uri="http://schemas.openxmlformats.org/drawingml/2006/picture">
-                <pic:pic>
-                  <pic:nvPicPr>
-                    <pic:cNvPr id="0" name="reliability_diagram.png"/>
-                    <pic:cNvPicPr/>
-                  </pic:nvPicPr>
-                  <pic:blipFill>
-                    <a:blip r:embed="rId12"/>
-                    <a:stretch>
-                      <a:fillRect/>
-                    </a:stretch>
-                  </pic:blipFill>
-                  <pic:spPr>
-                    <a:xfrm>
-                      <a:off x="0" y="0"/>
-                      <a:ext cx="2907792" cy="1881512"/>
-                    </a:xfrm>
-                    <a:prstGeom prst="rect"/>
-                  </pic:spPr>
-                </pic:pic>
-              </a:graphicData>
-            </a:graphic>
-          </wp:inline>
-        </w:drawing>
-      </w:r>
-    </w:p>
-    <w:p>
-      <w:pPr>
-        <w:spacing w:after="60"/>
-        <w:jc w:val="center"/>
-      </w:pPr>
-      <w:r>
-        <w:rPr>
-          <w:sz w:val="16"/>
-        </w:rPr>
-        <w:t>Fig. 4. Post-calibration reliability on held-out data.</w:t>
-      </w:r>
-    </w:p>
-    <w:p>
-      <w:pPr>
-        <w:spacing w:before="100" w:after="40"/>
-        <w:jc w:val="center"/>
-      </w:pPr>
-      <w:r>
-        <w:rPr>
-          <w:rFonts w:ascii="Times New Roman" w:hAnsi="Times New Roman"/>
-          <w:b/>
-          <w:sz w:val="20"/>
-        </w:rPr>
-        <w:t>VII. IMPLEMENTATION PROGRESS</w:t>
-      </w:r>
-    </w:p>
-    <w:p>
-      <w:pPr>
-        <w:jc w:val="center"/>
-      </w:pPr>
-      <w:r>
-        <w:rPr>
-          <w:b/>
-          <w:sz w:val="16"/>
-        </w:rPr>
-        <w:t>TABLE VII. IMPLEMENTATION EVIDENCE</w:t>
-      </w:r>
-    </w:p>
-    <w:tbl>
-      <w:tblPr>
-        <w:tblStyle w:val="TableGrid"/>
-        <w:tblW w:type="auto" w:w="0"/>
-        <w:tblLook w:firstColumn="1" w:firstRow="1" w:lastColumn="0" w:lastRow="0" w:noHBand="0" w:noVBand="1" w:val="04A0"/>
-      </w:tblPr>
-      <w:tblGrid>
-        <w:gridCol w:w="5170"/>
-        <w:gridCol w:w="5170"/>
-      </w:tblGrid>
-      <w:tr>
-        <w:tc>
-          <w:tcPr>
-            <w:tcW w:type="dxa" w:w="5170"/>
-          </w:tcPr>
-          <w:p>
-            <w:pPr>
-              <w:spacing w:after="0"/>
-            </w:pPr>
-            <w:r>
-              <w:rPr>
-                <w:rFonts w:ascii="Times New Roman" w:hAnsi="Times New Roman"/>
-                <w:b/>
-                <w:sz w:val="15"/>
-              </w:rPr>
-              <w:t>Work package</w:t>
-            </w:r>
-          </w:p>
-        </w:tc>
-        <w:tc>
-          <w:tcPr>
-            <w:tcW w:type="dxa" w:w="5170"/>
-          </w:tcPr>
-          <w:p>
-            <w:pPr>
-              <w:spacing w:after="0"/>
-            </w:pPr>
-            <w:r>
-              <w:rPr>
-                <w:rFonts w:ascii="Times New Roman" w:hAnsi="Times New Roman"/>
-                <w:b/>
-                <w:sz w:val="15"/>
-              </w:rPr>
-              <w:t>Status</w:t>
-            </w:r>
-          </w:p>
-        </w:tc>
-      </w:tr>
-      <w:tr>
-        <w:tc>
-          <w:tcPr>
-            <w:tcW w:type="dxa" w:w="5170"/>
-          </w:tcPr>
-          <w:p>
-            <w:pPr>
-              <w:spacing w:after="0"/>
-            </w:pPr>
-            <w:r>
-              <w:rPr>
-                <w:rFonts w:ascii="Times New Roman" w:hAnsi="Times New Roman"/>
-                <w:b w:val="0"/>
-                <w:sz w:val="15"/>
-              </w:rPr>
-              <w:t>API, validation, typed errors</w:t>
-            </w:r>
-          </w:p>
-        </w:tc>
-        <w:tc>
-          <w:tcPr>
-            <w:tcW w:type="dxa" w:w="5170"/>
-          </w:tcPr>
-          <w:p>
-            <w:pPr>
-              <w:spacing w:after="0"/>
-            </w:pPr>
-            <w:r>
-              <w:rPr>
-                <w:rFonts w:ascii="Times New Roman" w:hAnsi="Times New Roman"/>
-                <w:b w:val="0"/>
-                <w:sz w:val="15"/>
-              </w:rPr>
-              <w:t>Complete</w:t>
-            </w:r>
-          </w:p>
-        </w:tc>
-      </w:tr>
-      <w:tr>
-        <w:tc>
-          <w:tcPr>
-            <w:tcW w:type="dxa" w:w="5170"/>
-          </w:tcPr>
-          <w:p>
-            <w:pPr>
-              <w:spacing w:after="0"/>
-            </w:pPr>
-            <w:r>
-              <w:rPr>
-                <w:rFonts w:ascii="Times New Roman" w:hAnsi="Times New Roman"/>
-                <w:b w:val="0"/>
-                <w:sz w:val="15"/>
-              </w:rPr>
-              <w:t>React UI, upload, live microphone</w:t>
-            </w:r>
-          </w:p>
-        </w:tc>
-        <w:tc>
-          <w:tcPr>
-            <w:tcW w:type="dxa" w:w="5170"/>
-          </w:tcPr>
-          <w:p>
-            <w:pPr>
-              <w:spacing w:after="0"/>
-            </w:pPr>
-            <w:r>
-              <w:rPr>
-                <w:rFonts w:ascii="Times New Roman" w:hAnsi="Times New Roman"/>
-                <w:b w:val="0"/>
-                <w:sz w:val="15"/>
-              </w:rPr>
-              <w:t>Complete</w:t>
-            </w:r>
-          </w:p>
-        </w:tc>
-      </w:tr>
-      <w:tr>
-        <w:tc>
-          <w:tcPr>
-            <w:tcW w:type="dxa" w:w="5170"/>
-          </w:tcPr>
-          <w:p>
-            <w:pPr>
-              <w:spacing w:after="0"/>
-            </w:pPr>
-            <w:r>
-              <w:rPr>
-                <w:rFonts w:ascii="Times New Roman" w:hAnsi="Times New Roman"/>
-                <w:b w:val="0"/>
-                <w:sz w:val="15"/>
-              </w:rPr>
-              <w:t>Kathbath + IndicSynth ingest (Baseline V1)</w:t>
-            </w:r>
-          </w:p>
-        </w:tc>
-        <w:tc>
-          <w:tcPr>
-            <w:tcW w:type="dxa" w:w="5170"/>
-          </w:tcPr>
-          <w:p>
-            <w:pPr>
-              <w:spacing w:after="0"/>
-            </w:pPr>
-            <w:r>
-              <w:rPr>
-                <w:rFonts w:ascii="Times New Roman" w:hAnsi="Times New Roman"/>
-                <w:b w:val="0"/>
-                <w:sz w:val="15"/>
-              </w:rPr>
-              <w:t>Complete</w:t>
-            </w:r>
-          </w:p>
-        </w:tc>
-      </w:tr>
-      <w:tr>
-        <w:tc>
-          <w:tcPr>
-            <w:tcW w:type="dxa" w:w="5170"/>
-          </w:tcPr>
-          <w:p>
-            <w:pPr>
-              <w:spacing w:after="0"/>
-            </w:pPr>
-            <w:r>
-              <w:rPr>
-                <w:rFonts w:ascii="Times New Roman" w:hAnsi="Times New Roman"/>
-                <w:b w:val="0"/>
-                <w:sz w:val="15"/>
-              </w:rPr>
-              <w:t>Speaker-disjoint training/evaluation</w:t>
-            </w:r>
-          </w:p>
-        </w:tc>
-        <w:tc>
-          <w:tcPr>
-            <w:tcW w:type="dxa" w:w="5170"/>
-          </w:tcPr>
-          <w:p>
-            <w:pPr>
-              <w:spacing w:after="0"/>
-            </w:pPr>
-            <w:r>
-              <w:rPr>
-                <w:rFonts w:ascii="Times New Roman" w:hAnsi="Times New Roman"/>
-                <w:b w:val="0"/>
-                <w:sz w:val="15"/>
-              </w:rPr>
-              <w:t>Complete</w:t>
-            </w:r>
-          </w:p>
-        </w:tc>
-      </w:tr>
-      <w:tr>
-        <w:tc>
-          <w:tcPr>
-            <w:tcW w:type="dxa" w:w="5170"/>
-          </w:tcPr>
-          <w:p>
-            <w:pPr>
-              <w:spacing w:after="0"/>
-            </w:pPr>
-            <w:r>
-              <w:rPr>
-                <w:rFonts w:ascii="Times New Roman" w:hAnsi="Times New Roman"/>
-                <w:b w:val="0"/>
-                <w:sz w:val="15"/>
-              </w:rPr>
-              <w:t>Opus paired evaluation</w:t>
-            </w:r>
-          </w:p>
-        </w:tc>
-        <w:tc>
-          <w:tcPr>
-            <w:tcW w:type="dxa" w:w="5170"/>
-          </w:tcPr>
-          <w:p>
-            <w:pPr>
-              <w:spacing w:after="0"/>
-            </w:pPr>
-            <w:r>
-              <w:rPr>
-                <w:rFonts w:ascii="Times New Roman" w:hAnsi="Times New Roman"/>
-                <w:b w:val="0"/>
-                <w:sz w:val="15"/>
-              </w:rPr>
-              <w:t>Complete</w:t>
-            </w:r>
-          </w:p>
-        </w:tc>
-      </w:tr>
-      <w:tr>
-        <w:tc>
-          <w:tcPr>
-            <w:tcW w:type="dxa" w:w="5170"/>
-          </w:tcPr>
-          <w:p>
-            <w:pPr>
-              <w:spacing w:after="0"/>
-            </w:pPr>
-            <w:r>
-              <w:rPr>
-                <w:rFonts w:ascii="Times New Roman" w:hAnsi="Times New Roman"/>
-                <w:b w:val="0"/>
-                <w:sz w:val="15"/>
-              </w:rPr>
-              <w:t>Calibration audit (val-selected global TS)</w:t>
-            </w:r>
-          </w:p>
-        </w:tc>
-        <w:tc>
-          <w:tcPr>
-            <w:tcW w:type="dxa" w:w="5170"/>
-          </w:tcPr>
-          <w:p>
-            <w:pPr>
-              <w:spacing w:after="0"/>
-            </w:pPr>
-            <w:r>
-              <w:rPr>
-                <w:rFonts w:ascii="Times New Roman" w:hAnsi="Times New Roman"/>
-                <w:b w:val="0"/>
-                <w:sz w:val="15"/>
-              </w:rPr>
-              <w:t>Complete</w:t>
-            </w:r>
-          </w:p>
-        </w:tc>
-      </w:tr>
-      <w:tr>
-        <w:tc>
-          <w:tcPr>
-            <w:tcW w:type="dxa" w:w="5170"/>
-          </w:tcPr>
-          <w:p>
-            <w:pPr>
-              <w:spacing w:after="0"/>
-            </w:pPr>
-            <w:r>
-              <w:rPr>
-                <w:rFonts w:ascii="Times New Roman" w:hAnsi="Times New Roman"/>
-                <w:b w:val="0"/>
-                <w:sz w:val="15"/>
-              </w:rPr>
-              <w:t>LFCC-GMM baseline</w:t>
-            </w:r>
-          </w:p>
-        </w:tc>
-        <w:tc>
-          <w:tcPr>
-            <w:tcW w:type="dxa" w:w="5170"/>
-          </w:tcPr>
-          <w:p>
-            <w:pPr>
-              <w:spacing w:after="0"/>
-            </w:pPr>
-            <w:r>
-              <w:rPr>
-                <w:rFonts w:ascii="Times New Roman" w:hAnsi="Times New Roman"/>
-                <w:b w:val="0"/>
-                <w:sz w:val="15"/>
-              </w:rPr>
-              <w:t>Complete</w:t>
-            </w:r>
-          </w:p>
-        </w:tc>
-      </w:tr>
-      <w:tr>
-        <w:tc>
-          <w:tcPr>
-            <w:tcW w:type="dxa" w:w="5170"/>
-          </w:tcPr>
-          <w:p>
-            <w:pPr>
-              <w:spacing w:after="0"/>
-            </w:pPr>
-            <w:r>
-              <w:rPr>
-                <w:rFonts w:ascii="Times New Roman" w:hAnsi="Times New Roman"/>
-                <w:b w:val="0"/>
-                <w:sz w:val="15"/>
-              </w:rPr>
-              <w:t>RawNet2-style approximate baseline</w:t>
-            </w:r>
-          </w:p>
-        </w:tc>
-        <w:tc>
-          <w:tcPr>
-            <w:tcW w:type="dxa" w:w="5170"/>
-          </w:tcPr>
-          <w:p>
-            <w:pPr>
-              <w:spacing w:after="0"/>
-            </w:pPr>
-            <w:r>
-              <w:rPr>
-                <w:rFonts w:ascii="Times New Roman" w:hAnsi="Times New Roman"/>
-                <w:b w:val="0"/>
-                <w:sz w:val="15"/>
-              </w:rPr>
-              <w:t>Complete (not canonical RawNet2)</w:t>
-            </w:r>
-          </w:p>
-        </w:tc>
-      </w:tr>
-      <w:tr>
-        <w:tc>
-          <w:tcPr>
-            <w:tcW w:type="dxa" w:w="5170"/>
-          </w:tcPr>
-          <w:p>
-            <w:pPr>
-              <w:spacing w:after="0"/>
-            </w:pPr>
-            <w:r>
-              <w:rPr>
-                <w:rFonts w:ascii="Times New Roman" w:hAnsi="Times New Roman"/>
-                <w:b w:val="0"/>
-                <w:sz w:val="15"/>
-              </w:rPr>
-              <w:t>RQ2 English-only ASVspoof control</w:t>
-            </w:r>
-          </w:p>
-        </w:tc>
-        <w:tc>
-          <w:tcPr>
-            <w:tcW w:type="dxa" w:w="5170"/>
-          </w:tcPr>
-          <w:p>
-            <w:pPr>
-              <w:spacing w:after="0"/>
-            </w:pPr>
-            <w:r>
-              <w:rPr>
-                <w:rFonts w:ascii="Times New Roman" w:hAnsi="Times New Roman"/>
-                <w:b w:val="0"/>
-                <w:sz w:val="15"/>
-              </w:rPr>
-              <w:t>Complete</w:t>
-            </w:r>
-          </w:p>
-        </w:tc>
-      </w:tr>
-      <w:tr>
-        <w:tc>
-          <w:tcPr>
-            <w:tcW w:type="dxa" w:w="5170"/>
-          </w:tcPr>
-          <w:p>
-            <w:pPr>
-              <w:spacing w:after="0"/>
-            </w:pPr>
-            <w:r>
-              <w:rPr>
-                <w:rFonts w:ascii="Times New Roman" w:hAnsi="Times New Roman"/>
-                <w:b w:val="0"/>
-                <w:sz w:val="15"/>
-              </w:rPr>
-              <w:t>RQ3 leave-one-language-out runs</w:t>
-            </w:r>
-          </w:p>
-        </w:tc>
-        <w:tc>
-          <w:tcPr>
-            <w:tcW w:type="dxa" w:w="5170"/>
-          </w:tcPr>
-          <w:p>
-            <w:pPr>
-              <w:spacing w:after="0"/>
-            </w:pPr>
-            <w:r>
-              <w:rPr>
-                <w:rFonts w:ascii="Times New Roman" w:hAnsi="Times New Roman"/>
-                <w:b w:val="0"/>
-                <w:sz w:val="15"/>
-              </w:rPr>
-              <w:t>Complete</w:t>
-            </w:r>
-          </w:p>
-        </w:tc>
-      </w:tr>
-      <w:tr>
-        <w:tc>
-          <w:tcPr>
-            <w:tcW w:type="dxa" w:w="5170"/>
-          </w:tcPr>
-          <w:p>
-            <w:pPr>
-              <w:spacing w:after="0"/>
-            </w:pPr>
-            <w:r>
-              <w:rPr>
-                <w:rFonts w:ascii="Times New Roman" w:hAnsi="Times New Roman"/>
-                <w:b w:val="0"/>
-                <w:sz w:val="15"/>
-              </w:rPr>
-              <w:t>Frozen XLS-R main experiment</w:t>
-            </w:r>
-          </w:p>
-        </w:tc>
-        <w:tc>
-          <w:tcPr>
-            <w:tcW w:type="dxa" w:w="5170"/>
-          </w:tcPr>
-          <w:p>
-            <w:pPr>
-              <w:spacing w:after="0"/>
-            </w:pPr>
-            <w:r>
-              <w:rPr>
-                <w:rFonts w:ascii="Times New Roman" w:hAnsi="Times New Roman"/>
-                <w:b w:val="0"/>
-                <w:sz w:val="15"/>
-              </w:rPr>
-              <w:t>In progress / see artifacts/xlsr_main</w:t>
-            </w:r>
-          </w:p>
-        </w:tc>
-      </w:tr>
-      <w:tr>
-        <w:tc>
-          <w:tcPr>
-            <w:tcW w:type="dxa" w:w="5170"/>
-          </w:tcPr>
-          <w:p>
-            <w:pPr>
-              <w:spacing w:after="0"/>
-            </w:pPr>
-            <w:r>
-              <w:rPr>
-                <w:rFonts w:ascii="Times New Roman" w:hAnsi="Times New Roman"/>
-                <w:b w:val="0"/>
-                <w:sz w:val="15"/>
-              </w:rPr>
-              <w:t>Benchmark V2 multi-source</w:t>
-            </w:r>
-          </w:p>
-        </w:tc>
-        <w:tc>
-          <w:tcPr>
-            <w:tcW w:type="dxa" w:w="5170"/>
-          </w:tcPr>
-          <w:p>
-            <w:pPr>
-              <w:spacing w:after="0"/>
-            </w:pPr>
-            <w:r>
-              <w:rPr>
-                <w:rFonts w:ascii="Times New Roman" w:hAnsi="Times New Roman"/>
-                <w:b w:val="0"/>
-                <w:sz w:val="15"/>
-              </w:rPr>
-              <w:t>In progress</w:t>
-            </w:r>
-          </w:p>
-        </w:tc>
-      </w:tr>
-      <w:tr>
-        <w:tc>
-          <w:tcPr>
-            <w:tcW w:type="dxa" w:w="5170"/>
-          </w:tcPr>
-          <w:p>
-            <w:pPr>
-              <w:spacing w:after="0"/>
-            </w:pPr>
-            <w:r>
-              <w:rPr>
-                <w:rFonts w:ascii="Times New Roman" w:hAnsi="Times New Roman"/>
-                <w:b w:val="0"/>
-                <w:sz w:val="15"/>
-              </w:rPr>
-              <w:t>RQ5 participant data collection</w:t>
-            </w:r>
-          </w:p>
-        </w:tc>
-        <w:tc>
-          <w:tcPr>
-            <w:tcW w:type="dxa" w:w="5170"/>
-          </w:tcPr>
-          <w:p>
-            <w:pPr>
-              <w:spacing w:after="0"/>
-            </w:pPr>
-            <w:r>
-              <w:rPr>
-                <w:rFonts w:ascii="Times New Roman" w:hAnsi="Times New Roman"/>
-                <w:b w:val="0"/>
-                <w:sz w:val="15"/>
-              </w:rPr>
-              <w:t>Pending (N=0)</w:t>
-            </w:r>
-          </w:p>
-        </w:tc>
-      </w:tr>
-    </w:tbl>
-    <w:p>
-      <w:pPr>
-        <w:jc w:val="center"/>
-      </w:pPr>
-      <w:r>
-        <w:rPr>
-          <w:b/>
-          <w:sz w:val="16"/>
-        </w:rPr>
-        <w:t>TABLE VII-B. BASELINE MATRIX ON IDENTICAL V1 TEST PROTOCOL</w:t>
+        <w:t>TABLE VII. RQ3 LEAVE-ONE-LANGUAGE-OUT TRANSFER</w:t>
       </w:r>
     </w:p>
     <w:tbl>
@@ -2936,7 +3171,7 @@
                 <w:b/>
                 <w:sz w:val="15"/>
               </w:rPr>
-              <w:t>Model</w:t>
+              <w:t>Held-out language</w:t>
             </w:r>
           </w:p>
         </w:tc>
@@ -3010,7 +3245,7 @@
                 <w:b w:val="0"/>
                 <w:sz w:val="15"/>
               </w:rPr>
-              <w:t>lfcc_gmm</w:t>
+              <w:t>Hindi</w:t>
             </w:r>
           </w:p>
         </w:tc>
@@ -3028,7 +3263,7 @@
                 <w:b w:val="0"/>
                 <w:sz w:val="15"/>
               </w:rPr>
-              <w:t>584</w:t>
+              <w:t>222</w:t>
             </w:r>
           </w:p>
         </w:tc>
@@ -3046,7 +3281,7 @@
                 <w:b w:val="0"/>
                 <w:sz w:val="15"/>
               </w:rPr>
-              <w:t>54.8%</w:t>
+              <w:t>78.83%</w:t>
             </w:r>
           </w:p>
         </w:tc>
@@ -3064,7 +3299,7 @@
                 <w:b w:val="0"/>
                 <w:sz w:val="15"/>
               </w:rPr>
-              <w:t>23.5%</w:t>
+              <w:t>21.83%</w:t>
             </w:r>
           </w:p>
         </w:tc>
@@ -3084,7 +3319,7 @@
                 <w:b w:val="0"/>
                 <w:sz w:val="15"/>
               </w:rPr>
-              <w:t>rawnet2_style_approx</w:t>
+              <w:t>Marathi</w:t>
             </w:r>
           </w:p>
         </w:tc>
@@ -3102,7 +3337,7 @@
                 <w:b w:val="0"/>
                 <w:sz w:val="15"/>
               </w:rPr>
-              <w:t>584</w:t>
+              <w:t>164</w:t>
             </w:r>
           </w:p>
         </w:tc>
@@ -3120,7 +3355,7 @@
                 <w:b w:val="0"/>
                 <w:sz w:val="15"/>
               </w:rPr>
-              <w:t>54.8%</w:t>
+              <w:t>93.29%</w:t>
             </w:r>
           </w:p>
         </w:tc>
@@ -3138,7 +3373,7 @@
                 <w:b w:val="0"/>
                 <w:sz w:val="15"/>
               </w:rPr>
-              <w:t>43.2%</w:t>
+              <w:t>7.14%</w:t>
             </w:r>
           </w:p>
         </w:tc>
@@ -3158,7 +3393,7 @@
                 <w:b w:val="0"/>
                 <w:sz w:val="15"/>
               </w:rPr>
-              <w:t>acoustic_aasist_v1</w:t>
+              <w:t>Tamil</w:t>
             </w:r>
           </w:p>
         </w:tc>
@@ -3176,7 +3411,7 @@
                 <w:b w:val="0"/>
                 <w:sz w:val="15"/>
               </w:rPr>
-              <w:t>584</w:t>
+              <w:t>198</w:t>
             </w:r>
           </w:p>
         </w:tc>
@@ -3194,7 +3429,7 @@
                 <w:b w:val="0"/>
                 <w:sz w:val="15"/>
               </w:rPr>
-              <w:t>93.7%</w:t>
+              <w:t>93.94%</w:t>
             </w:r>
           </w:p>
         </w:tc>
@@ -3212,12 +3447,87 @@
                 <w:b w:val="0"/>
                 <w:sz w:val="15"/>
               </w:rPr>
-              <w:t>6.6%</w:t>
+              <w:t>6.35%</w:t>
             </w:r>
           </w:p>
         </w:tc>
       </w:tr>
     </w:tbl>
+    <w:p>
+      <w:pPr>
+        <w:spacing w:after="40" w:line="240" w:lineRule="auto"/>
+        <w:ind w:firstLine="230"/>
+        <w:jc w:val="both"/>
+      </w:pPr>
+      <w:r>
+        <w:t>Cross-lingual transfer was asymmetric. Hindi held-out accuracy was 78.83% with 21.83% EER, whereas Marathi and Tamil reached 93.29% and 93.94%. The study does not claim uniform language-independent generalization.</w:t>
+      </w:r>
+    </w:p>
+    <w:p>
+      <w:pPr>
+        <w:jc w:val="center"/>
+      </w:pPr>
+      <w:r>
+        <w:drawing>
+          <wp:inline xmlns:a="http://schemas.openxmlformats.org/drawingml/2006/main" xmlns:pic="http://schemas.openxmlformats.org/drawingml/2006/picture">
+            <wp:extent cx="2907792" cy="1680058"/>
+            <wp:docPr id="4" name="Picture 4"/>
+            <wp:cNvGraphicFramePr>
+              <a:graphicFrameLocks noChangeAspect="1"/>
+            </wp:cNvGraphicFramePr>
+            <a:graphic>
+              <a:graphicData uri="http://schemas.openxmlformats.org/drawingml/2006/picture">
+                <pic:pic>
+                  <pic:nvPicPr>
+                    <pic:cNvPr id="0" name="cross_lingual_transfer.png"/>
+                    <pic:cNvPicPr/>
+                  </pic:nvPicPr>
+                  <pic:blipFill>
+                    <a:blip r:embed="rId12"/>
+                    <a:stretch>
+                      <a:fillRect/>
+                    </a:stretch>
+                  </pic:blipFill>
+                  <pic:spPr>
+                    <a:xfrm>
+                      <a:off x="0" y="0"/>
+                      <a:ext cx="2907792" cy="1680058"/>
+                    </a:xfrm>
+                    <a:prstGeom prst="rect"/>
+                  </pic:spPr>
+                </pic:pic>
+              </a:graphicData>
+            </a:graphic>
+          </wp:inline>
+        </w:drawing>
+      </w:r>
+    </w:p>
+    <w:p>
+      <w:pPr>
+        <w:spacing w:after="60"/>
+        <w:jc w:val="center"/>
+      </w:pPr>
+      <w:r>
+        <w:rPr>
+          <w:sz w:val="16"/>
+        </w:rPr>
+        <w:t>Fig. 4. Leave-one-language-out transfer. Hindi is substantially weaker than Marathi and Tamil.</w:t>
+      </w:r>
+    </w:p>
+    <w:p>
+      <w:pPr>
+        <w:spacing w:before="100" w:after="40"/>
+        <w:jc w:val="center"/>
+      </w:pPr>
+      <w:r>
+        <w:rPr>
+          <w:rFonts w:ascii="Times New Roman" w:hAnsi="Times New Roman"/>
+          <w:b/>
+          <w:sz w:val="20"/>
+        </w:rPr>
+        <w:t>IX. CALIBRATION (RQ4)</w:t>
+      </w:r>
+    </w:p>
     <w:p>
       <w:pPr>
         <w:jc w:val="center"/>
@@ -3227,7 +3537,7 @@
           <w:b/>
           <w:sz w:val="16"/>
         </w:rPr>
-        <w:t>TABLE VIII. RQ2 ENGLISH-ONLY VS MULTILINGUAL ON INDIC HELD-OUT TEST</w:t>
+        <w:t>TABLE VIII. RQ4 CALIBRATION SELECTION AND HELD-OUT OUTCOME</w:t>
       </w:r>
     </w:p>
     <w:tbl>
@@ -3256,7 +3566,7 @@
                 <w:b/>
                 <w:sz w:val="15"/>
               </w:rPr>
-              <w:t>Model</w:t>
+              <w:t>Quantity</w:t>
             </w:r>
           </w:p>
         </w:tc>
@@ -3274,7 +3584,7 @@
                 <w:b/>
                 <w:sz w:val="15"/>
               </w:rPr>
-              <w:t>Indic test accuracy</w:t>
+              <w:t>Value</w:t>
             </w:r>
           </w:p>
         </w:tc>
@@ -3292,7 +3602,7 @@
                 <w:b/>
                 <w:sz w:val="15"/>
               </w:rPr>
-              <w:t>Indic test EER</w:t>
+              <w:t>Split</w:t>
             </w:r>
           </w:p>
         </w:tc>
@@ -3312,7 +3622,7 @@
                 <w:b w:val="0"/>
                 <w:sz w:val="15"/>
               </w:rPr>
-              <w:t>English-only (ASVspoof LA train)</w:t>
+              <w:t>Selected Baseline V1 strategy</w:t>
             </w:r>
           </w:p>
         </w:tc>
@@ -3330,7 +3640,7 @@
                 <w:b w:val="0"/>
                 <w:sz w:val="15"/>
               </w:rPr>
-              <w:t>54.8%</w:t>
+              <w:t>per_language_and_condition</w:t>
             </w:r>
           </w:p>
         </w:tc>
@@ -3348,7 +3658,7 @@
                 <w:b w:val="0"/>
                 <w:sz w:val="15"/>
               </w:rPr>
-              <w:t>78.8%</w:t>
+              <w:t>Validation only</w:t>
             </w:r>
           </w:p>
         </w:tc>
@@ -3368,7 +3678,7 @@
                 <w:b w:val="0"/>
                 <w:sz w:val="15"/>
               </w:rPr>
-              <w:t>Multilingual (hi+mr+ta)</w:t>
+              <w:t>Selected strategy val ECE</w:t>
             </w:r>
           </w:p>
         </w:tc>
@@ -3386,7 +3696,7 @@
                 <w:b w:val="0"/>
                 <w:sz w:val="15"/>
               </w:rPr>
-              <w:t>93.7%</w:t>
+              <w:t>0.0487</w:t>
             </w:r>
           </w:p>
         </w:tc>
@@ -3404,7 +3714,231 @@
                 <w:b w:val="0"/>
                 <w:sz w:val="15"/>
               </w:rPr>
-              <w:t>6.6%</w:t>
+              <w:t>Validation</w:t>
+            </w:r>
+          </w:p>
+        </w:tc>
+      </w:tr>
+      <w:tr>
+        <w:tc>
+          <w:tcPr>
+            <w:tcW w:type="dxa" w:w="3447"/>
+          </w:tcPr>
+          <w:p>
+            <w:pPr>
+              <w:spacing w:after="0"/>
+            </w:pPr>
+            <w:r>
+              <w:rPr>
+                <w:rFonts w:ascii="Times New Roman" w:hAnsi="Times New Roman"/>
+                <w:b w:val="0"/>
+                <w:sz w:val="15"/>
+              </w:rPr>
+              <w:t>Global TS val ECE</w:t>
+            </w:r>
+          </w:p>
+        </w:tc>
+        <w:tc>
+          <w:tcPr>
+            <w:tcW w:type="dxa" w:w="3447"/>
+          </w:tcPr>
+          <w:p>
+            <w:pPr>
+              <w:spacing w:after="0"/>
+            </w:pPr>
+            <w:r>
+              <w:rPr>
+                <w:rFonts w:ascii="Times New Roman" w:hAnsi="Times New Roman"/>
+                <w:b w:val="0"/>
+                <w:sz w:val="15"/>
+              </w:rPr>
+              <w:t>0.0513</w:t>
+            </w:r>
+          </w:p>
+        </w:tc>
+        <w:tc>
+          <w:tcPr>
+            <w:tcW w:type="dxa" w:w="3447"/>
+          </w:tcPr>
+          <w:p>
+            <w:pPr>
+              <w:spacing w:after="0"/>
+            </w:pPr>
+            <w:r>
+              <w:rPr>
+                <w:rFonts w:ascii="Times New Roman" w:hAnsi="Times New Roman"/>
+                <w:b w:val="0"/>
+                <w:sz w:val="15"/>
+              </w:rPr>
+              <w:t>Validation</w:t>
+            </w:r>
+          </w:p>
+        </w:tc>
+      </w:tr>
+      <w:tr>
+        <w:tc>
+          <w:tcPr>
+            <w:tcW w:type="dxa" w:w="3447"/>
+          </w:tcPr>
+          <w:p>
+            <w:pPr>
+              <w:spacing w:after="0"/>
+            </w:pPr>
+            <w:r>
+              <w:rPr>
+                <w:rFonts w:ascii="Times New Roman" w:hAnsi="Times New Roman"/>
+                <w:b w:val="0"/>
+                <w:sz w:val="15"/>
+              </w:rPr>
+              <w:t>Uncalibrated test ECE</w:t>
+            </w:r>
+          </w:p>
+        </w:tc>
+        <w:tc>
+          <w:tcPr>
+            <w:tcW w:type="dxa" w:w="3447"/>
+          </w:tcPr>
+          <w:p>
+            <w:pPr>
+              <w:spacing w:after="0"/>
+            </w:pPr>
+            <w:r>
+              <w:rPr>
+                <w:rFonts w:ascii="Times New Roman" w:hAnsi="Times New Roman"/>
+                <w:b w:val="0"/>
+                <w:sz w:val="15"/>
+              </w:rPr>
+              <w:t>0.0245</w:t>
+            </w:r>
+          </w:p>
+        </w:tc>
+        <w:tc>
+          <w:tcPr>
+            <w:tcW w:type="dxa" w:w="3447"/>
+          </w:tcPr>
+          <w:p>
+            <w:pPr>
+              <w:spacing w:after="0"/>
+            </w:pPr>
+            <w:r>
+              <w:rPr>
+                <w:rFonts w:ascii="Times New Roman" w:hAnsi="Times New Roman"/>
+                <w:b w:val="0"/>
+                <w:sz w:val="15"/>
+              </w:rPr>
+              <w:t>Held-out test</w:t>
+            </w:r>
+          </w:p>
+        </w:tc>
+      </w:tr>
+      <w:tr>
+        <w:tc>
+          <w:tcPr>
+            <w:tcW w:type="dxa" w:w="3447"/>
+          </w:tcPr>
+          <w:p>
+            <w:pPr>
+              <w:spacing w:after="0"/>
+            </w:pPr>
+            <w:r>
+              <w:rPr>
+                <w:rFonts w:ascii="Times New Roman" w:hAnsi="Times New Roman"/>
+                <w:b w:val="0"/>
+                <w:sz w:val="15"/>
+              </w:rPr>
+              <w:t>Post-calibration test ECE</w:t>
+            </w:r>
+          </w:p>
+        </w:tc>
+        <w:tc>
+          <w:tcPr>
+            <w:tcW w:type="dxa" w:w="3447"/>
+          </w:tcPr>
+          <w:p>
+            <w:pPr>
+              <w:spacing w:after="0"/>
+            </w:pPr>
+            <w:r>
+              <w:rPr>
+                <w:rFonts w:ascii="Times New Roman" w:hAnsi="Times New Roman"/>
+                <w:b w:val="0"/>
+                <w:sz w:val="15"/>
+              </w:rPr>
+              <w:t>0.0260</w:t>
+            </w:r>
+          </w:p>
+        </w:tc>
+        <w:tc>
+          <w:tcPr>
+            <w:tcW w:type="dxa" w:w="3447"/>
+          </w:tcPr>
+          <w:p>
+            <w:pPr>
+              <w:spacing w:after="0"/>
+            </w:pPr>
+            <w:r>
+              <w:rPr>
+                <w:rFonts w:ascii="Times New Roman" w:hAnsi="Times New Roman"/>
+                <w:b w:val="0"/>
+                <w:sz w:val="15"/>
+              </w:rPr>
+              <w:t>Held-out test</w:t>
+            </w:r>
+          </w:p>
+        </w:tc>
+      </w:tr>
+      <w:tr>
+        <w:tc>
+          <w:tcPr>
+            <w:tcW w:type="dxa" w:w="3447"/>
+          </w:tcPr>
+          <w:p>
+            <w:pPr>
+              <w:spacing w:after="0"/>
+            </w:pPr>
+            <w:r>
+              <w:rPr>
+                <w:rFonts w:ascii="Times New Roman" w:hAnsi="Times New Roman"/>
+                <w:b w:val="0"/>
+                <w:sz w:val="15"/>
+              </w:rPr>
+              <w:t>Exploratory best-by-test-ECE</w:t>
+            </w:r>
+          </w:p>
+        </w:tc>
+        <w:tc>
+          <w:tcPr>
+            <w:tcW w:type="dxa" w:w="3447"/>
+          </w:tcPr>
+          <w:p>
+            <w:pPr>
+              <w:spacing w:after="0"/>
+            </w:pPr>
+            <w:r>
+              <w:rPr>
+                <w:rFonts w:ascii="Times New Roman" w:hAnsi="Times New Roman"/>
+                <w:b w:val="0"/>
+                <w:sz w:val="15"/>
+              </w:rPr>
+              <w:t>global_temperature</w:t>
+            </w:r>
+          </w:p>
+        </w:tc>
+        <w:tc>
+          <w:tcPr>
+            <w:tcW w:type="dxa" w:w="3447"/>
+          </w:tcPr>
+          <w:p>
+            <w:pPr>
+              <w:spacing w:after="0"/>
+            </w:pPr>
+            <w:r>
+              <w:rPr>
+                <w:rFonts w:ascii="Times New Roman" w:hAnsi="Times New Roman"/>
+                <w:b w:val="0"/>
+                <w:sz w:val="15"/>
+              </w:rPr>
+              <w:t>Not used for selection</w:t>
             </w:r>
           </w:p>
         </w:tc>
@@ -3412,26 +3946,12 @@
     </w:tbl>
     <w:p>
       <w:pPr>
-        <w:spacing w:before="100" w:after="40"/>
-        <w:jc w:val="center"/>
-      </w:pPr>
-      <w:r>
-        <w:rPr>
-          <w:rFonts w:ascii="Times New Roman" w:hAnsi="Times New Roman"/>
-          <w:b/>
-          <w:sz w:val="20"/>
-        </w:rPr>
-        <w:t>VIII. LIMITATIONS AND THREATS TO VALIDITY</w:t>
-      </w:r>
-    </w:p>
-    <w:p>
-      <w:pPr>
         <w:spacing w:after="40" w:line="240" w:lineRule="auto"/>
         <w:ind w:firstLine="230"/>
         <w:jc w:val="both"/>
       </w:pPr>
       <w:r>
-        <w:t>The measured corpus is a bounded subset rather than the complete 303 GB six-cell source collection. Dataset-source artefacts may make discrimination easier than unseen-generator detection. The current front-end is a compact deterministic embedding, not the final frozen XLS-R representation. RQ2 and RQ5 remain incomplete; consequently, no claim is made for those questions or for generalization beyond the persisted manifest. RQ3 is reported as a measured leave-one-language-out baseline.</w:t>
+        <w:t>Calibration strategy was selected using validation only. For Baseline V1, the selected fine-grained per-language-and-condition strategy (val ECE 0.0487 versus global 0.0513) did not improve held-out ECE (0.0245 uncalibrated to 0.026 post-calibration). A standalone test comparison where global temperature scaling looked better (test ECE 0.0378 versus exploratory global TS) is not evidence for selecting the production strategy. Validation-selected calibration did not uniformly improve held-out calibration. Frozen XLS-R used global temperature scaling selected on validation.</w:t>
       </w:r>
     </w:p>
     <w:p>
@@ -3445,9 +3965,552 @@
           <w:b/>
           <w:sz w:val="20"/>
         </w:rPr>
-        <w:t>IX. ETHICS AND REPRODUCIBILITY</w:t>
+        <w:t>X. V2 PILOT AND GENERALIZATION STATUS</w:t>
       </w:r>
     </w:p>
+    <w:p>
+      <w:pPr>
+        <w:jc w:val="center"/>
+      </w:pPr>
+      <w:r>
+        <w:rPr>
+          <w:b/>
+          <w:sz w:val="16"/>
+        </w:rPr>
+        <w:t>TABLE IX. V2 PILOT AND REMAINING GENERALIZATION STATUS</w:t>
+      </w:r>
+    </w:p>
+    <w:tbl>
+      <w:tblPr>
+        <w:tblStyle w:val="TableGrid"/>
+        <w:tblW w:type="auto" w:w="0"/>
+        <w:tblLook w:firstColumn="1" w:firstRow="1" w:lastColumn="0" w:lastRow="0" w:noHBand="0" w:noVBand="1" w:val="04A0"/>
+      </w:tblPr>
+      <w:tblGrid>
+        <w:gridCol w:w="2585"/>
+        <w:gridCol w:w="2585"/>
+        <w:gridCol w:w="2585"/>
+        <w:gridCol w:w="2585"/>
+      </w:tblGrid>
+      <w:tr>
+        <w:tc>
+          <w:tcPr>
+            <w:tcW w:type="dxa" w:w="2585"/>
+          </w:tcPr>
+          <w:p>
+            <w:pPr>
+              <w:spacing w:after="0"/>
+            </w:pPr>
+            <w:r>
+              <w:rPr>
+                <w:rFonts w:ascii="Times New Roman" w:hAnsi="Times New Roman"/>
+                <w:b/>
+                <w:sz w:val="15"/>
+              </w:rPr>
+              <w:t>Eval</w:t>
+            </w:r>
+          </w:p>
+        </w:tc>
+        <w:tc>
+          <w:tcPr>
+            <w:tcW w:type="dxa" w:w="2585"/>
+          </w:tcPr>
+          <w:p>
+            <w:pPr>
+              <w:spacing w:after="0"/>
+            </w:pPr>
+            <w:r>
+              <w:rPr>
+                <w:rFonts w:ascii="Times New Roman" w:hAnsi="Times New Roman"/>
+                <w:b/>
+                <w:sz w:val="15"/>
+              </w:rPr>
+              <w:t>n</w:t>
+            </w:r>
+          </w:p>
+        </w:tc>
+        <w:tc>
+          <w:tcPr>
+            <w:tcW w:type="dxa" w:w="2585"/>
+          </w:tcPr>
+          <w:p>
+            <w:pPr>
+              <w:spacing w:after="0"/>
+            </w:pPr>
+            <w:r>
+              <w:rPr>
+                <w:rFonts w:ascii="Times New Roman" w:hAnsi="Times New Roman"/>
+                <w:b/>
+                <w:sz w:val="15"/>
+              </w:rPr>
+              <w:t>Status</w:t>
+            </w:r>
+          </w:p>
+        </w:tc>
+        <w:tc>
+          <w:tcPr>
+            <w:tcW w:type="dxa" w:w="2585"/>
+          </w:tcPr>
+          <w:p>
+            <w:pPr>
+              <w:spacing w:after="0"/>
+            </w:pPr>
+            <w:r>
+              <w:rPr>
+                <w:rFonts w:ascii="Times New Roman" w:hAnsi="Times New Roman"/>
+                <w:b/>
+                <w:sz w:val="15"/>
+              </w:rPr>
+              <w:t>Result</w:t>
+            </w:r>
+          </w:p>
+        </w:tc>
+      </w:tr>
+      <w:tr>
+        <w:tc>
+          <w:tcPr>
+            <w:tcW w:type="dxa" w:w="2585"/>
+          </w:tcPr>
+          <w:p>
+            <w:pPr>
+              <w:spacing w:after="0"/>
+            </w:pPr>
+            <w:r>
+              <w:rPr>
+                <w:rFonts w:ascii="Times New Roman" w:hAnsi="Times New Roman"/>
+                <w:b w:val="0"/>
+                <w:sz w:val="15"/>
+              </w:rPr>
+              <w:t>V2 full test</w:t>
+            </w:r>
+          </w:p>
+        </w:tc>
+        <w:tc>
+          <w:tcPr>
+            <w:tcW w:type="dxa" w:w="2585"/>
+          </w:tcPr>
+          <w:p>
+            <w:pPr>
+              <w:spacing w:after="0"/>
+            </w:pPr>
+            <w:r>
+              <w:rPr>
+                <w:rFonts w:ascii="Times New Roman" w:hAnsi="Times New Roman"/>
+                <w:b w:val="0"/>
+                <w:sz w:val="15"/>
+              </w:rPr>
+              <w:t>593</w:t>
+            </w:r>
+          </w:p>
+        </w:tc>
+        <w:tc>
+          <w:tcPr>
+            <w:tcW w:type="dxa" w:w="2585"/>
+          </w:tcPr>
+          <w:p>
+            <w:pPr>
+              <w:spacing w:after="0"/>
+            </w:pPr>
+            <w:r>
+              <w:rPr>
+                <w:rFonts w:ascii="Times New Roman" w:hAnsi="Times New Roman"/>
+                <w:b w:val="0"/>
+                <w:sz w:val="15"/>
+              </w:rPr>
+              <w:t>PARTIAL</w:t>
+            </w:r>
+          </w:p>
+        </w:tc>
+        <w:tc>
+          <w:tcPr>
+            <w:tcW w:type="dxa" w:w="2585"/>
+          </w:tcPr>
+          <w:p>
+            <w:pPr>
+              <w:spacing w:after="0"/>
+            </w:pPr>
+            <w:r>
+              <w:rPr>
+                <w:rFonts w:ascii="Times New Roman" w:hAnsi="Times New Roman"/>
+                <w:b w:val="0"/>
+                <w:sz w:val="15"/>
+              </w:rPr>
+              <w:t>Pilot population, not confound-free</w:t>
+            </w:r>
+          </w:p>
+        </w:tc>
+      </w:tr>
+      <w:tr>
+        <w:tc>
+          <w:tcPr>
+            <w:tcW w:type="dxa" w:w="2585"/>
+          </w:tcPr>
+          <w:p>
+            <w:pPr>
+              <w:spacing w:after="0"/>
+            </w:pPr>
+            <w:r>
+              <w:rPr>
+                <w:rFonts w:ascii="Times New Roman" w:hAnsi="Times New Roman"/>
+                <w:b w:val="0"/>
+                <w:sz w:val="15"/>
+              </w:rPr>
+              <w:t>FLEURS unseen-real</w:t>
+            </w:r>
+          </w:p>
+        </w:tc>
+        <w:tc>
+          <w:tcPr>
+            <w:tcW w:type="dxa" w:w="2585"/>
+          </w:tcPr>
+          <w:p>
+            <w:pPr>
+              <w:spacing w:after="0"/>
+            </w:pPr>
+            <w:r>
+              <w:rPr>
+                <w:rFonts w:ascii="Times New Roman" w:hAnsi="Times New Roman"/>
+                <w:b w:val="0"/>
+                <w:sz w:val="15"/>
+              </w:rPr>
+              <w:t>9</w:t>
+            </w:r>
+          </w:p>
+        </w:tc>
+        <w:tc>
+          <w:tcPr>
+            <w:tcW w:type="dxa" w:w="2585"/>
+          </w:tcPr>
+          <w:p>
+            <w:pPr>
+              <w:spacing w:after="0"/>
+            </w:pPr>
+            <w:r>
+              <w:rPr>
+                <w:rFonts w:ascii="Times New Roman" w:hAnsi="Times New Roman"/>
+                <w:b w:val="0"/>
+                <w:sz w:val="15"/>
+              </w:rPr>
+              <w:t>PILOT</w:t>
+            </w:r>
+          </w:p>
+        </w:tc>
+        <w:tc>
+          <w:tcPr>
+            <w:tcW w:type="dxa" w:w="2585"/>
+          </w:tcPr>
+          <w:p>
+            <w:pPr>
+              <w:spacing w:after="0"/>
+            </w:pPr>
+            <w:r>
+              <w:rPr>
+                <w:rFonts w:ascii="Times New Roman" w:hAnsi="Times New Roman"/>
+                <w:b w:val="0"/>
+                <w:sz w:val="15"/>
+              </w:rPr>
+              <w:t>55.6% retained only as pipeline validation</w:t>
+            </w:r>
+          </w:p>
+        </w:tc>
+      </w:tr>
+      <w:tr>
+        <w:tc>
+          <w:tcPr>
+            <w:tcW w:type="dxa" w:w="2585"/>
+          </w:tcPr>
+          <w:p>
+            <w:pPr>
+              <w:spacing w:after="0"/>
+            </w:pPr>
+            <w:r>
+              <w:rPr>
+                <w:rFonts w:ascii="Times New Roman" w:hAnsi="Times New Roman"/>
+                <w:b w:val="0"/>
+                <w:sz w:val="15"/>
+              </w:rPr>
+              <w:t>Generator-disjoint</w:t>
+            </w:r>
+          </w:p>
+        </w:tc>
+        <w:tc>
+          <w:tcPr>
+            <w:tcW w:type="dxa" w:w="2585"/>
+          </w:tcPr>
+          <w:p>
+            <w:pPr>
+              <w:spacing w:after="0"/>
+            </w:pPr>
+            <w:r>
+              <w:rPr>
+                <w:rFonts w:ascii="Times New Roman" w:hAnsi="Times New Roman"/>
+                <w:b w:val="0"/>
+                <w:sz w:val="15"/>
+              </w:rPr>
+              <w:t>0</w:t>
+            </w:r>
+          </w:p>
+        </w:tc>
+        <w:tc>
+          <w:tcPr>
+            <w:tcW w:type="dxa" w:w="2585"/>
+          </w:tcPr>
+          <w:p>
+            <w:pPr>
+              <w:spacing w:after="0"/>
+            </w:pPr>
+            <w:r>
+              <w:rPr>
+                <w:rFonts w:ascii="Times New Roman" w:hAnsi="Times New Roman"/>
+                <w:b w:val="0"/>
+                <w:sz w:val="15"/>
+              </w:rPr>
+              <w:t>PENDING</w:t>
+            </w:r>
+          </w:p>
+        </w:tc>
+        <w:tc>
+          <w:tcPr>
+            <w:tcW w:type="dxa" w:w="2585"/>
+          </w:tcPr>
+          <w:p>
+            <w:pPr>
+              <w:spacing w:after="0"/>
+            </w:pPr>
+            <w:r>
+              <w:rPr>
+                <w:rFonts w:ascii="Times New Roman" w:hAnsi="Times New Roman"/>
+                <w:b w:val="0"/>
+                <w:sz w:val="15"/>
+              </w:rPr>
+              <w:t>No result claimed</w:t>
+            </w:r>
+          </w:p>
+        </w:tc>
+      </w:tr>
+      <w:tr>
+        <w:tc>
+          <w:tcPr>
+            <w:tcW w:type="dxa" w:w="2585"/>
+          </w:tcPr>
+          <w:p>
+            <w:pPr>
+              <w:spacing w:after="0"/>
+            </w:pPr>
+            <w:r>
+              <w:rPr>
+                <w:rFonts w:ascii="Times New Roman" w:hAnsi="Times New Roman"/>
+                <w:b w:val="0"/>
+                <w:sz w:val="15"/>
+              </w:rPr>
+              <w:t>V2 source probe</w:t>
+            </w:r>
+          </w:p>
+        </w:tc>
+        <w:tc>
+          <w:tcPr>
+            <w:tcW w:type="dxa" w:w="2585"/>
+          </w:tcPr>
+          <w:p>
+            <w:pPr>
+              <w:spacing w:after="0"/>
+            </w:pPr>
+            <w:r>
+              <w:rPr>
+                <w:rFonts w:ascii="Times New Roman" w:hAnsi="Times New Roman"/>
+                <w:b w:val="0"/>
+                <w:sz w:val="15"/>
+              </w:rPr>
+              <w:t>593</w:t>
+            </w:r>
+          </w:p>
+        </w:tc>
+        <w:tc>
+          <w:tcPr>
+            <w:tcW w:type="dxa" w:w="2585"/>
+          </w:tcPr>
+          <w:p>
+            <w:pPr>
+              <w:spacing w:after="0"/>
+            </w:pPr>
+            <w:r>
+              <w:rPr>
+                <w:rFonts w:ascii="Times New Roman" w:hAnsi="Times New Roman"/>
+                <w:b w:val="0"/>
+                <w:sz w:val="15"/>
+              </w:rPr>
+              <w:t>PARTIAL</w:t>
+            </w:r>
+          </w:p>
+        </w:tc>
+        <w:tc>
+          <w:tcPr>
+            <w:tcW w:type="dxa" w:w="2585"/>
+          </w:tcPr>
+          <w:p>
+            <w:pPr>
+              <w:spacing w:after="0"/>
+            </w:pPr>
+            <w:r>
+              <w:rPr>
+                <w:rFonts w:ascii="Times New Roman" w:hAnsi="Times New Roman"/>
+                <w:b w:val="0"/>
+                <w:sz w:val="15"/>
+              </w:rPr>
+              <w:t>98.48% source identity</w:t>
+            </w:r>
+          </w:p>
+        </w:tc>
+      </w:tr>
+      <w:tr>
+        <w:tc>
+          <w:tcPr>
+            <w:tcW w:type="dxa" w:w="2585"/>
+          </w:tcPr>
+          <w:p>
+            <w:pPr>
+              <w:spacing w:after="0"/>
+            </w:pPr>
+            <w:r>
+              <w:rPr>
+                <w:rFonts w:ascii="Times New Roman" w:hAnsi="Times New Roman"/>
+                <w:b w:val="0"/>
+                <w:sz w:val="15"/>
+              </w:rPr>
+              <w:t>Faithful RawNet2</w:t>
+            </w:r>
+          </w:p>
+        </w:tc>
+        <w:tc>
+          <w:tcPr>
+            <w:tcW w:type="dxa" w:w="2585"/>
+          </w:tcPr>
+          <w:p>
+            <w:pPr>
+              <w:spacing w:after="0"/>
+            </w:pPr>
+            <w:r>
+              <w:rPr>
+                <w:rFonts w:ascii="Times New Roman" w:hAnsi="Times New Roman"/>
+                <w:b w:val="0"/>
+                <w:sz w:val="15"/>
+              </w:rPr>
+              <w:t>-</w:t>
+            </w:r>
+          </w:p>
+        </w:tc>
+        <w:tc>
+          <w:tcPr>
+            <w:tcW w:type="dxa" w:w="2585"/>
+          </w:tcPr>
+          <w:p>
+            <w:pPr>
+              <w:spacing w:after="0"/>
+            </w:pPr>
+            <w:r>
+              <w:rPr>
+                <w:rFonts w:ascii="Times New Roman" w:hAnsi="Times New Roman"/>
+                <w:b w:val="0"/>
+                <w:sz w:val="15"/>
+              </w:rPr>
+              <w:t>PENDING</w:t>
+            </w:r>
+          </w:p>
+        </w:tc>
+        <w:tc>
+          <w:tcPr>
+            <w:tcW w:type="dxa" w:w="2585"/>
+          </w:tcPr>
+          <w:p>
+            <w:pPr>
+              <w:spacing w:after="0"/>
+            </w:pPr>
+            <w:r>
+              <w:rPr>
+                <w:rFonts w:ascii="Times New Roman" w:hAnsi="Times New Roman"/>
+                <w:b w:val="0"/>
+                <w:sz w:val="15"/>
+              </w:rPr>
+              <w:t>Not implemented</w:t>
+            </w:r>
+          </w:p>
+        </w:tc>
+      </w:tr>
+      <w:tr>
+        <w:tc>
+          <w:tcPr>
+            <w:tcW w:type="dxa" w:w="2585"/>
+          </w:tcPr>
+          <w:p>
+            <w:pPr>
+              <w:spacing w:after="0"/>
+            </w:pPr>
+            <w:r>
+              <w:rPr>
+                <w:rFonts w:ascii="Times New Roman" w:hAnsi="Times New Roman"/>
+                <w:b w:val="0"/>
+                <w:sz w:val="15"/>
+              </w:rPr>
+              <w:t>RQ5 human study</w:t>
+            </w:r>
+          </w:p>
+        </w:tc>
+        <w:tc>
+          <w:tcPr>
+            <w:tcW w:type="dxa" w:w="2585"/>
+          </w:tcPr>
+          <w:p>
+            <w:pPr>
+              <w:spacing w:after="0"/>
+            </w:pPr>
+            <w:r>
+              <w:rPr>
+                <w:rFonts w:ascii="Times New Roman" w:hAnsi="Times New Roman"/>
+                <w:b w:val="0"/>
+                <w:sz w:val="15"/>
+              </w:rPr>
+              <w:t>0</w:t>
+            </w:r>
+          </w:p>
+        </w:tc>
+        <w:tc>
+          <w:tcPr>
+            <w:tcW w:type="dxa" w:w="2585"/>
+          </w:tcPr>
+          <w:p>
+            <w:pPr>
+              <w:spacing w:after="0"/>
+            </w:pPr>
+            <w:r>
+              <w:rPr>
+                <w:rFonts w:ascii="Times New Roman" w:hAnsi="Times New Roman"/>
+                <w:b w:val="0"/>
+                <w:sz w:val="15"/>
+              </w:rPr>
+              <w:t>BLOCKED ON HUMAN DATA</w:t>
+            </w:r>
+          </w:p>
+        </w:tc>
+        <w:tc>
+          <w:tcPr>
+            <w:tcW w:type="dxa" w:w="2585"/>
+          </w:tcPr>
+          <w:p>
+            <w:pPr>
+              <w:spacing w:after="0"/>
+            </w:pPr>
+            <w:r>
+              <w:rPr>
+                <w:rFonts w:ascii="Times New Roman" w:hAnsi="Times New Roman"/>
+                <w:b w:val="0"/>
+                <w:sz w:val="15"/>
+              </w:rPr>
+              <w:t>Protocol ready; N=0</w:t>
+            </w:r>
+          </w:p>
+        </w:tc>
+      </w:tr>
+    </w:tbl>
     <w:p>
       <w:pPr>
         <w:spacing w:after="40" w:line="240" w:lineRule="auto"/>
@@ -3455,7 +4518,7 @@
         <w:jc w:val="both"/>
       </w:pPr>
       <w:r>
-        <w:t>Audio is excluded from version control. The manifest records source, label, speaker, split, duration, checksum, and generation model. Kathbath access conditions and IndicSynth non-commercial restrictions are respected. The human protocol is anonymous and reveals no gold labels during trials.</w:t>
+        <w:t>V2 source-probe accuracy is 98.48% versus a 85.83% label probe, showing that source identity remains highly predictable. No statistically useful unseen-source estimate is claimed from the current nine held-out FLEURS clips; the result is retained only as pipeline-validation evidence. Human-study protocol ready; participant data collection pending (N=0).</w:t>
       </w:r>
     </w:p>
     <w:p>
@@ -3469,7 +4532,7 @@
           <w:b/>
           <w:sz w:val="20"/>
         </w:rPr>
-        <w:t>X. CONCLUSION</w:t>
+        <w:t>XI. LIMITATIONS AND THREATS TO VALIDITY</w:t>
       </w:r>
     </w:p>
     <w:p>
@@ -3479,7 +4542,79 @@
         <w:jc w:val="both"/>
       </w:pPr>
       <w:r>
-        <w:t>VaaniQ demonstrates an end-to-end multilingual audio-deepfake research apparatus with real/fake source ingest, speaker-disjoint evaluation, compression testing, calibrated confidence, explainability, and a live web application. The current measurements establish a reproducible mid-term baseline; planned detector baselines, cross-lingual runs, and human responses are required for the final conference-oriented study.</w:t>
+        <w:t>Key threats are: (1) V1 source-label confound; (2) bounded dataset size; (3) academic speech versus actual scam audio; (4) simulated Opus versus real WhatsApp transport; (5) three-language scope; (6) no faithful RawNet2; (7) incomplete V2; (8) V2 source probe 98.48%; (9) FLEURS external pilot n=9; (10) generator-disjoint n=0; (11) RQ5 N=0; (12) calibration transfer uncertainty; (13) validation/test heterogeneity (Tamil val 71.5% versus test 90.9%; Marathi val 98.4% versus test 93.3%) with no proven leakage but no fully resolved cause; and (14) no claim of universal unseen-generator robustness. Strong EER/ROC-AUC can coexist with Baseline V1 min-DCF 0.7841 because min-DCF uses a 5% target prior.</w:t>
+      </w:r>
+    </w:p>
+    <w:p>
+      <w:pPr>
+        <w:spacing w:before="100" w:after="40"/>
+        <w:jc w:val="center"/>
+      </w:pPr>
+      <w:r>
+        <w:rPr>
+          <w:rFonts w:ascii="Times New Roman" w:hAnsi="Times New Roman"/>
+          <w:b/>
+          <w:sz w:val="20"/>
+        </w:rPr>
+        <w:t>XII. ETHICS</w:t>
+      </w:r>
+    </w:p>
+    <w:p>
+      <w:pPr>
+        <w:spacing w:after="40" w:line="240" w:lineRule="auto"/>
+        <w:ind w:firstLine="230"/>
+        <w:jc w:val="both"/>
+      </w:pPr>
+      <w:r>
+        <w:t>Audio and model weights are excluded from version control. Kathbath access conditions and IndicSynth non-commercial restrictions are respected. The human protocol is anonymous, reveals no gold labels during trials, and has not yet collected participants.</w:t>
+      </w:r>
+    </w:p>
+    <w:p>
+      <w:pPr>
+        <w:spacing w:before="100" w:after="40"/>
+        <w:jc w:val="center"/>
+      </w:pPr>
+      <w:r>
+        <w:rPr>
+          <w:rFonts w:ascii="Times New Roman" w:hAnsi="Times New Roman"/>
+          <w:b/>
+          <w:sz w:val="20"/>
+        </w:rPr>
+        <w:t>XIII. REPRODUCIBILITY</w:t>
+      </w:r>
+    </w:p>
+    <w:p>
+      <w:pPr>
+        <w:spacing w:after="40" w:line="240" w:lineRule="auto"/>
+        <w:ind w:firstLine="230"/>
+        <w:jc w:val="both"/>
+      </w:pPr>
+      <w:r>
+        <w:t>Authoritative metrics are frozen in artifacts/final_results_manifest.json at commit 084bd47ca6ca1b69a7cdbf424e2946f3794c2a95. Manifests record source, label, speaker, split, duration, checksum, and generation model. Integrity verification is scripts/verify_research_integrity.py. Documents must consume the frozen manifest rather than superseded checkpoints or rounded tables.</w:t>
+      </w:r>
+    </w:p>
+    <w:p>
+      <w:pPr>
+        <w:spacing w:before="100" w:after="40"/>
+        <w:jc w:val="center"/>
+      </w:pPr>
+      <w:r>
+        <w:rPr>
+          <w:rFonts w:ascii="Times New Roman" w:hAnsi="Times New Roman"/>
+          <w:b/>
+          <w:sz w:val="20"/>
+        </w:rPr>
+        <w:t>XIV. CONCLUSION</w:t>
+      </w:r>
+    </w:p>
+    <w:p>
+      <w:pPr>
+        <w:spacing w:after="40" w:line="240" w:lineRule="auto"/>
+        <w:ind w:firstLine="230"/>
+        <w:jc w:val="both"/>
+      </w:pPr>
+      <w:r>
+        <w:t>VaaniQ establishes a reproducible multilingual research framework for studying audio-deepfake detection under language, codec, and confidence-calibration shift. On the bounded V1 benchmark, both the acoustic and frozen XLS-R pipelines achieve strong held-out discrimination, while cross-language, calibration, and external-source experiments expose important limitations. The current evidence supports the value of multilingual evaluation but does not establish universal source- or generator-independent detection.</w:t>
       </w:r>
     </w:p>
     <w:p>
@@ -3505,7 +4640,7 @@
         <w:rPr>
           <w:sz w:val="16"/>
         </w:rPr>
-        <w:t>[1] J. Jung et al., AASIST: Audio anti-spoofing using integrated spectro-temporal graph attention networks, ICASSP, 2022.</w:t>
+        <w:t>[1] J. Jung et al., AASIST: Audio anti-spoofing using integrated spectro-temporal graph attention networks, in Proc. ICASSP, 2022.</w:t>
       </w:r>
     </w:p>
     <w:p>
@@ -3553,7 +4688,7 @@
         <w:rPr>
           <w:sz w:val="16"/>
         </w:rPr>
-        <w:t>[5] O. Pascu et al., Towards calibrated and explainable audio deepfake detection, Interspeech, 2024.</w:t>
+        <w:t>[5] O. Pascu et al., Towards calibrated and explainable audio deepfake detection, in Proc. Interspeech, 2024.</w:t>
       </w:r>
     </w:p>
     <w:p>
@@ -3565,7 +4700,7 @@
         <w:rPr>
           <w:sz w:val="16"/>
         </w:rPr>
-        <w:t>[6] R. Mller et al., Human perception of audio deepfakes, ACM Workshop on Information Hiding and Multimedia Security, 2022.</w:t>
+        <w:t>[6] N. M. Muller et al., Human perception of audio deepfakes, in Proc. ACM Workshop on Information Hiding and Multimedia Security, 2022.</w:t>
       </w:r>
     </w:p>
     <w:p>
@@ -3577,7 +4712,7 @@
         <w:rPr>
           <w:sz w:val="16"/>
         </w:rPr>
-        <w:t>[7] McAfee, The Artificial Imposter, May 2023.</w:t>
+        <w:t>[7] AI4Bharat, Kathbath dataset, Hugging Face: ai4bharat/Kathbath.</w:t>
       </w:r>
     </w:p>
     <w:p>
@@ -3589,7 +4724,7 @@
         <w:rPr>
           <w:sz w:val="16"/>
         </w:rPr>
-        <w:t>[8] AI4Bharat, Kathbath dataset, Hugging Face: ai4bharat/Kathbath.</w:t>
+        <w:t>[8] D. V. Sharma et al., IndicSynth dataset, Hugging Face: vdivyasharma/IndicSynth.</w:t>
       </w:r>
     </w:p>
     <w:p>
@@ -3601,7 +4736,31 @@
         <w:rPr>
           <w:sz w:val="16"/>
         </w:rPr>
-        <w:t>[9] D. V. Sharma et al., IndicSynth dataset, Hugging Face: vdivyasharma/IndicSynth.</w:t>
+        <w:t>[9] A. Conneau et al., FLEURS: Few-shot learning evaluation of universal representations of speech, arXiv:2205.12446, 2022.</w:t>
+      </w:r>
+    </w:p>
+    <w:p>
+      <w:pPr>
+        <w:spacing w:after="20"/>
+        <w:ind w:left="202" w:hanging="202"/>
+      </w:pPr>
+      <w:r>
+        <w:rPr>
+          <w:sz w:val="16"/>
+        </w:rPr>
+        <w:t>[10] IETF RFC 6716, Definition of the Opus Audio Codec, 2012.</w:t>
+      </w:r>
+    </w:p>
+    <w:p>
+      <w:pPr>
+        <w:spacing w:after="20"/>
+        <w:ind w:left="202" w:hanging="202"/>
+      </w:pPr>
+      <w:r>
+        <w:rPr>
+          <w:sz w:val="16"/>
+        </w:rPr>
+        <w:t>[11] ASVspoof 2019, logical access evaluation plan; English-only control uses a streaming subset of Bisher/ASVspoof_2019_LA (ODC-By).</w:t>
       </w:r>
     </w:p>
     <w:sectPr>

</xml_diff>